<commit_message>
Finalize cached contents for the operating guide
</commit_message>
<xml_diff>
--- a/docs/ModelUnify_Operating_Guide.docx
+++ b/docs/ModelUnify_Operating_Guide.docx
@@ -693,91 +693,6 @@
               </w:rPr>
               <w:t xml:space="preserve">Operating implications</w:t>
               <w:tab/>
-              <w:t xml:space="preserve">3</w:t>
-            </w:r>
-          </w:hyperlink>
-          <w:r>
-            <w:rPr>
-              <w:rtl w:val="0"/>
-            </w:rPr>
-          </w:r>
-        </w:p>
-        <w:p>
-          <w:pPr>
-            <w:widowControl w:val="0"/>
-            <w:tabs>
-              <w:tab w:val="right" w:leader="dot" w:pos="12000"/>
-            </w:tabs>
-            <w:spacing w:after="0" w:before="60" w:line="240" w:lineRule="auto"/>
-            <w:rPr>
-              <w:b w:val="1"/>
-              <w:bCs w:val="1"/>
-              <w:color w:val="000000"/>
-              <w:u w:val="none"/>
-            </w:rPr>
-          </w:pPr>
-          <w:hyperlink w:anchor="_heading=">
-            <w:r>
-              <w:rPr>
-                <w:rFonts w:ascii="Helvetica Neue" w:cs="Helvetica Neue" w:eastAsia="Helvetica Neue" w:hAnsi="Helvetica Neue"/>
-                <w:b w:val="0"/>
-                <w:bCs w:val="0"/>
-                <w:i w:val="0"/>
-                <w:iCs w:val="0"/>
-                <w:smallCaps w:val="0"/>
-                <w:strike w:val="0"/>
-                <w:color w:val="000000"/>
-                <w:sz w:val="22"/>
-                <w:szCs w:val="22"/>
-                <w:u w:val="none"/>
-                <w:shd w:fill="auto" w:val="clear"/>
-                <w:vertAlign w:val="baseline"/>
-                <w:rtl w:val="0"/>
-              </w:rPr>
-              <w:t xml:space="preserve">Recommendations</w:t>
-              <w:tab/>
-              <w:t xml:space="preserve">4</w:t>
-            </w:r>
-          </w:hyperlink>
-          <w:r>
-            <w:rPr>
-              <w:rtl w:val="0"/>
-            </w:rPr>
-          </w:r>
-        </w:p>
-        <w:p>
-          <w:pPr>
-            <w:widowControl w:val="0"/>
-            <w:tabs>
-              <w:tab w:val="right" w:leader="dot" w:pos="12000"/>
-            </w:tabs>
-            <w:spacing w:after="0" w:before="60" w:line="240" w:lineRule="auto"/>
-            <w:ind w:left="360" w:firstLine="0"/>
-            <w:rPr>
-              <w:color w:val="000000"/>
-              <w:u w:val="none"/>
-            </w:rPr>
-          </w:pPr>
-          <w:hyperlink w:anchor="_heading=">
-            <w:r>
-              <w:rPr>
-                <w:rFonts w:ascii="Helvetica Neue" w:cs="Helvetica Neue" w:eastAsia="Helvetica Neue" w:hAnsi="Helvetica Neue"/>
-                <w:b w:val="0"/>
-                <w:bCs w:val="0"/>
-                <w:i w:val="0"/>
-                <w:iCs w:val="0"/>
-                <w:smallCaps w:val="0"/>
-                <w:strike w:val="0"/>
-                <w:color w:val="000000"/>
-                <w:sz w:val="22"/>
-                <w:szCs w:val="22"/>
-                <w:u w:val="none"/>
-                <w:shd w:fill="auto" w:val="clear"/>
-                <w:vertAlign w:val="baseline"/>
-                <w:rtl w:val="0"/>
-              </w:rPr>
-              <w:t xml:space="preserve">Quality checks</w:t>
-              <w:tab/>
               <w:t xml:space="preserve">4</w:t>
             </w:r>
           </w:hyperlink>
@@ -819,9 +734,9 @@
                 <w:vertAlign w:val="baseline"/>
                 <w:rtl w:val="0"/>
               </w:rPr>
-              <w:t xml:space="preserve">Appendix</w:t>
+              <w:t xml:space="preserve">Recommendations</w:t>
               <w:tab/>
-              <w:t xml:space="preserve">5</w:t>
+              <w:t xml:space="preserve">6</w:t>
             </w:r>
           </w:hyperlink>
           <w:r>
@@ -861,9 +776,52 @@
                 <w:vertAlign w:val="baseline"/>
                 <w:rtl w:val="0"/>
               </w:rPr>
-              <w:t xml:space="preserve">Restore models</w:t>
+              <w:t xml:space="preserve">Quality checks</w:t>
               <w:tab/>
-              <w:t xml:space="preserve">5</w:t>
+              <w:t xml:space="preserve">7</w:t>
+            </w:r>
+          </w:hyperlink>
+          <w:r>
+            <w:rPr>
+              <w:rtl w:val="0"/>
+            </w:rPr>
+          </w:r>
+        </w:p>
+        <w:p>
+          <w:pPr>
+            <w:widowControl w:val="0"/>
+            <w:tabs>
+              <w:tab w:val="right" w:leader="dot" w:pos="12000"/>
+            </w:tabs>
+            <w:spacing w:after="0" w:before="60" w:line="240" w:lineRule="auto"/>
+            <w:rPr>
+              <w:b w:val="1"/>
+              <w:bCs w:val="1"/>
+              <w:color w:val="000000"/>
+              <w:u w:val="none"/>
+            </w:rPr>
+          </w:pPr>
+          <w:hyperlink w:anchor="_heading=">
+            <w:r>
+              <w:rPr>
+                <w:rFonts w:ascii="Helvetica Neue" w:cs="Helvetica Neue" w:eastAsia="Helvetica Neue" w:hAnsi="Helvetica Neue"/>
+                <w:b w:val="0"/>
+                <w:bCs w:val="0"/>
+                <w:i w:val="0"/>
+                <w:iCs w:val="0"/>
+                <w:smallCaps w:val="0"/>
+                <w:strike w:val="0"/>
+                <w:color w:val="000000"/>
+                <w:sz w:val="22"/>
+                <w:szCs w:val="22"/>
+                <w:u w:val="none"/>
+                <w:shd w:fill="auto" w:val="clear"/>
+                <w:vertAlign w:val="baseline"/>
+                <w:rtl w:val="0"/>
+              </w:rPr>
+              <w:t xml:space="preserve">Appendix</w:t>
+              <w:tab/>
+              <w:t xml:space="preserve">8</w:t>
             </w:r>
           </w:hyperlink>
           <w:r>
@@ -903,9 +861,51 @@
                 <w:vertAlign w:val="baseline"/>
                 <w:rtl w:val="0"/>
               </w:rPr>
+              <w:t xml:space="preserve">Restore models</w:t>
+              <w:tab/>
+              <w:t xml:space="preserve">8</w:t>
+            </w:r>
+          </w:hyperlink>
+          <w:r>
+            <w:rPr>
+              <w:rtl w:val="0"/>
+            </w:rPr>
+          </w:r>
+        </w:p>
+        <w:p>
+          <w:pPr>
+            <w:widowControl w:val="0"/>
+            <w:tabs>
+              <w:tab w:val="right" w:leader="dot" w:pos="12000"/>
+            </w:tabs>
+            <w:spacing w:after="0" w:before="60" w:line="240" w:lineRule="auto"/>
+            <w:ind w:left="360" w:firstLine="0"/>
+            <w:rPr>
+              <w:color w:val="000000"/>
+              <w:u w:val="none"/>
+            </w:rPr>
+          </w:pPr>
+          <w:hyperlink w:anchor="_heading=">
+            <w:r>
+              <w:rPr>
+                <w:rFonts w:ascii="Helvetica Neue" w:cs="Helvetica Neue" w:eastAsia="Helvetica Neue" w:hAnsi="Helvetica Neue"/>
+                <w:b w:val="0"/>
+                <w:bCs w:val="0"/>
+                <w:i w:val="0"/>
+                <w:iCs w:val="0"/>
+                <w:smallCaps w:val="0"/>
+                <w:strike w:val="0"/>
+                <w:color w:val="000000"/>
+                <w:sz w:val="22"/>
+                <w:szCs w:val="22"/>
+                <w:u w:val="none"/>
+                <w:shd w:fill="auto" w:val="clear"/>
+                <w:vertAlign w:val="baseline"/>
+                <w:rtl w:val="0"/>
+              </w:rPr>
               <w:t xml:space="preserve">Troubleshooting and sources</w:t>
               <w:tab/>
-              <w:t xml:space="preserve">5</w:t>
+              <w:t xml:space="preserve">8</w:t>
             </w:r>
           </w:hyperlink>
           <w:r>

</xml_diff>

<commit_message>
Finalize cached contents for the operating guide (#1)
</commit_message>
<xml_diff>
--- a/docs/ModelUnify_Operating_Guide.docx
+++ b/docs/ModelUnify_Operating_Guide.docx
@@ -693,91 +693,6 @@
               </w:rPr>
               <w:t xml:space="preserve">Operating implications</w:t>
               <w:tab/>
-              <w:t xml:space="preserve">3</w:t>
-            </w:r>
-          </w:hyperlink>
-          <w:r>
-            <w:rPr>
-              <w:rtl w:val="0"/>
-            </w:rPr>
-          </w:r>
-        </w:p>
-        <w:p>
-          <w:pPr>
-            <w:widowControl w:val="0"/>
-            <w:tabs>
-              <w:tab w:val="right" w:leader="dot" w:pos="12000"/>
-            </w:tabs>
-            <w:spacing w:after="0" w:before="60" w:line="240" w:lineRule="auto"/>
-            <w:rPr>
-              <w:b w:val="1"/>
-              <w:bCs w:val="1"/>
-              <w:color w:val="000000"/>
-              <w:u w:val="none"/>
-            </w:rPr>
-          </w:pPr>
-          <w:hyperlink w:anchor="_heading=">
-            <w:r>
-              <w:rPr>
-                <w:rFonts w:ascii="Helvetica Neue" w:cs="Helvetica Neue" w:eastAsia="Helvetica Neue" w:hAnsi="Helvetica Neue"/>
-                <w:b w:val="0"/>
-                <w:bCs w:val="0"/>
-                <w:i w:val="0"/>
-                <w:iCs w:val="0"/>
-                <w:smallCaps w:val="0"/>
-                <w:strike w:val="0"/>
-                <w:color w:val="000000"/>
-                <w:sz w:val="22"/>
-                <w:szCs w:val="22"/>
-                <w:u w:val="none"/>
-                <w:shd w:fill="auto" w:val="clear"/>
-                <w:vertAlign w:val="baseline"/>
-                <w:rtl w:val="0"/>
-              </w:rPr>
-              <w:t xml:space="preserve">Recommendations</w:t>
-              <w:tab/>
-              <w:t xml:space="preserve">4</w:t>
-            </w:r>
-          </w:hyperlink>
-          <w:r>
-            <w:rPr>
-              <w:rtl w:val="0"/>
-            </w:rPr>
-          </w:r>
-        </w:p>
-        <w:p>
-          <w:pPr>
-            <w:widowControl w:val="0"/>
-            <w:tabs>
-              <w:tab w:val="right" w:leader="dot" w:pos="12000"/>
-            </w:tabs>
-            <w:spacing w:after="0" w:before="60" w:line="240" w:lineRule="auto"/>
-            <w:ind w:left="360" w:firstLine="0"/>
-            <w:rPr>
-              <w:color w:val="000000"/>
-              <w:u w:val="none"/>
-            </w:rPr>
-          </w:pPr>
-          <w:hyperlink w:anchor="_heading=">
-            <w:r>
-              <w:rPr>
-                <w:rFonts w:ascii="Helvetica Neue" w:cs="Helvetica Neue" w:eastAsia="Helvetica Neue" w:hAnsi="Helvetica Neue"/>
-                <w:b w:val="0"/>
-                <w:bCs w:val="0"/>
-                <w:i w:val="0"/>
-                <w:iCs w:val="0"/>
-                <w:smallCaps w:val="0"/>
-                <w:strike w:val="0"/>
-                <w:color w:val="000000"/>
-                <w:sz w:val="22"/>
-                <w:szCs w:val="22"/>
-                <w:u w:val="none"/>
-                <w:shd w:fill="auto" w:val="clear"/>
-                <w:vertAlign w:val="baseline"/>
-                <w:rtl w:val="0"/>
-              </w:rPr>
-              <w:t xml:space="preserve">Quality checks</w:t>
-              <w:tab/>
               <w:t xml:space="preserve">4</w:t>
             </w:r>
           </w:hyperlink>
@@ -819,9 +734,9 @@
                 <w:vertAlign w:val="baseline"/>
                 <w:rtl w:val="0"/>
               </w:rPr>
-              <w:t xml:space="preserve">Appendix</w:t>
+              <w:t xml:space="preserve">Recommendations</w:t>
               <w:tab/>
-              <w:t xml:space="preserve">5</w:t>
+              <w:t xml:space="preserve">6</w:t>
             </w:r>
           </w:hyperlink>
           <w:r>
@@ -861,9 +776,52 @@
                 <w:vertAlign w:val="baseline"/>
                 <w:rtl w:val="0"/>
               </w:rPr>
-              <w:t xml:space="preserve">Restore models</w:t>
+              <w:t xml:space="preserve">Quality checks</w:t>
               <w:tab/>
-              <w:t xml:space="preserve">5</w:t>
+              <w:t xml:space="preserve">7</w:t>
+            </w:r>
+          </w:hyperlink>
+          <w:r>
+            <w:rPr>
+              <w:rtl w:val="0"/>
+            </w:rPr>
+          </w:r>
+        </w:p>
+        <w:p>
+          <w:pPr>
+            <w:widowControl w:val="0"/>
+            <w:tabs>
+              <w:tab w:val="right" w:leader="dot" w:pos="12000"/>
+            </w:tabs>
+            <w:spacing w:after="0" w:before="60" w:line="240" w:lineRule="auto"/>
+            <w:rPr>
+              <w:b w:val="1"/>
+              <w:bCs w:val="1"/>
+              <w:color w:val="000000"/>
+              <w:u w:val="none"/>
+            </w:rPr>
+          </w:pPr>
+          <w:hyperlink w:anchor="_heading=">
+            <w:r>
+              <w:rPr>
+                <w:rFonts w:ascii="Helvetica Neue" w:cs="Helvetica Neue" w:eastAsia="Helvetica Neue" w:hAnsi="Helvetica Neue"/>
+                <w:b w:val="0"/>
+                <w:bCs w:val="0"/>
+                <w:i w:val="0"/>
+                <w:iCs w:val="0"/>
+                <w:smallCaps w:val="0"/>
+                <w:strike w:val="0"/>
+                <w:color w:val="000000"/>
+                <w:sz w:val="22"/>
+                <w:szCs w:val="22"/>
+                <w:u w:val="none"/>
+                <w:shd w:fill="auto" w:val="clear"/>
+                <w:vertAlign w:val="baseline"/>
+                <w:rtl w:val="0"/>
+              </w:rPr>
+              <w:t xml:space="preserve">Appendix</w:t>
+              <w:tab/>
+              <w:t xml:space="preserve">8</w:t>
             </w:r>
           </w:hyperlink>
           <w:r>
@@ -903,9 +861,51 @@
                 <w:vertAlign w:val="baseline"/>
                 <w:rtl w:val="0"/>
               </w:rPr>
+              <w:t xml:space="preserve">Restore models</w:t>
+              <w:tab/>
+              <w:t xml:space="preserve">8</w:t>
+            </w:r>
+          </w:hyperlink>
+          <w:r>
+            <w:rPr>
+              <w:rtl w:val="0"/>
+            </w:rPr>
+          </w:r>
+        </w:p>
+        <w:p>
+          <w:pPr>
+            <w:widowControl w:val="0"/>
+            <w:tabs>
+              <w:tab w:val="right" w:leader="dot" w:pos="12000"/>
+            </w:tabs>
+            <w:spacing w:after="0" w:before="60" w:line="240" w:lineRule="auto"/>
+            <w:ind w:left="360" w:firstLine="0"/>
+            <w:rPr>
+              <w:color w:val="000000"/>
+              <w:u w:val="none"/>
+            </w:rPr>
+          </w:pPr>
+          <w:hyperlink w:anchor="_heading=">
+            <w:r>
+              <w:rPr>
+                <w:rFonts w:ascii="Helvetica Neue" w:cs="Helvetica Neue" w:eastAsia="Helvetica Neue" w:hAnsi="Helvetica Neue"/>
+                <w:b w:val="0"/>
+                <w:bCs w:val="0"/>
+                <w:i w:val="0"/>
+                <w:iCs w:val="0"/>
+                <w:smallCaps w:val="0"/>
+                <w:strike w:val="0"/>
+                <w:color w:val="000000"/>
+                <w:sz w:val="22"/>
+                <w:szCs w:val="22"/>
+                <w:u w:val="none"/>
+                <w:shd w:fill="auto" w:val="clear"/>
+                <w:vertAlign w:val="baseline"/>
+                <w:rtl w:val="0"/>
+              </w:rPr>
               <w:t xml:space="preserve">Troubleshooting and sources</w:t>
               <w:tab/>
-              <w:t xml:space="preserve">5</w:t>
+              <w:t xml:space="preserve">8</w:t>
             </w:r>
           </w:hyperlink>
           <w:r>

</xml_diff>

<commit_message>
Trim public repository to application source and current user guides
</commit_message>
<xml_diff>
--- a/docs/ModelUnify_Operating_Guide.docx
+++ b/docs/ModelUnify_Operating_Guide.docx
@@ -953,7 +953,7 @@
         <w:rPr>
           <w:rtl w:val="0"/>
         </w:rPr>
-        <w:t xml:space="preserve">Version 1.11.2 source excludes AI weights. This workstation retains its environments and native extensions. Existing meshes still support inspection, manual masks, CPU optimization, UV rebaking and export. Generation, paint and learned preparation need restored weights. Fresh clones also need Python and native-extension setup.</w:t>
+        <w:t xml:space="preserve">Version 1.11.3 keeps AI weights optional. After installing the main environment, existing meshes support inspection, manual masks, CPU optimization, UV rebaking and export. Generation, paint and learned preparation need their model downloads. Fresh installations also need the native extensions before painting.</w:t>
       </w:r>
     </w:p>
     <w:bookmarkStart w:colFirst="0" w:colLast="0" w:name="bookmark=id.1sqjewf8afxt" w:id="2"/>
@@ -1143,7 +1143,7 @@
         <w:rPr>
           <w:rtl w:val="0"/>
         </w:rPr>
-        <w:t xml:space="preserve">Fresh clones need CPython 3.11 x64 and the environment setup in docs/DEVELOPMENT.md. Restore selected model weights separately. On a new machine, build native paint extensions with compatible MSVC/CUDA tools; Git excludes machine-specific binaries.</w:t>
+        <w:t xml:space="preserve">Fresh clones need CPython 3.11 x64 and the environment setup in docs/INSTALLATION.md. Restore selected model weights separately. On a new machine, build native paint extensions with compatible MSVC/CUDA tools; Git excludes machine-specific binaries.</w:t>
       </w:r>
     </w:p>
     <w:bookmarkStart w:colFirst="0" w:colLast="0" w:name="bookmark=id.xx7bxdemqiq" w:id="4"/>
@@ -1605,7 +1605,7 @@
                 <w:vertAlign w:val="baseline"/>
                 <w:rtl w:val="0"/>
               </w:rPr>
-              <w:t xml:space="preserve">Available after cleanup</w:t>
+              <w:t xml:space="preserve">Availability</w:t>
             </w:r>
             <w:r>
               <w:rPr>
@@ -2631,7 +2631,7 @@
         <w:rPr>
           <w:rtl w:val="0"/>
         </w:rPr>
-        <w:t xml:space="preserve">The 28 October cleanup removed downloaded project AI weights while retaining code, environments, native modules and user assets. It also removed the named Hunyuan, DINOv2 and Marigold shared caches. Other applications using those caches must download their weights again.</w:t>
+        <w:t xml:space="preserve">Install only the model weights required for your next operation. Keep application environments, original assets and generated outputs separate from checkpoints. Several backends use a shared Hugging Face cache; removing a cached model can affect another application that uses it.</w:t>
       </w:r>
     </w:p>
     <w:p>
@@ -2653,7 +2653,7 @@
         <w:rPr>
           <w:rtl w:val="0"/>
         </w:rPr>
-        <w:t xml:space="preserve">Native TripoSG/RMBG use pretrained_weights. Hunyuan, Paint and DINOv2 use the Hugging Face cache; Paint also needs RealESRGAN_x4plus.pth. docs/MODEL_WEIGHTS.md gives exact commands, paths, sizes and checks. Selecting a model does not install its weights.</w:t>
+        <w:t xml:space="preserve">Native backends load TripoSG/RMBG from pretrained_weights. Hunyuan and DINO use the shared Hugging Face cache. Painting additionally requires the RealESRGAN checkpoint. See docs/MODEL_WEIGHTS.md for download commands and sizes. Selecting a model does not install it.</w:t>
       </w:r>
     </w:p>
     <w:p>
@@ -2850,7 +2850,7 @@
           <w:vertAlign w:val="baseline"/>
           <w:rtl w:val="0"/>
         </w:rPr>
-        <w:t xml:space="preserve">Sources: docs/WORKBENCH.md, ACCURACY_AUTHORING.md, COMFYUI.md, DEVELOPMENT.md and BMS_WORKFLOW.md. Controls: scripts/workbench/schema.py and comfyui_workflows.py. Repository: github.com/AsafBSh/ModelUnity.</w:t>
+        <w:t xml:space="preserve">Guides: docs/INSTALLATION.md, MODEL_WEIGHTS.md, COMFYUI.md and BMS_WORKFLOW.md. Controls: scripts/workbench/schema.py and comfyui_workflows.py. Repository: github.com/AsafBSh/ModelUnity.</w:t>
       </w:r>
     </w:p>
     <w:p>
@@ -2941,7 +2941,7 @@
           <w:vertAlign w:val="baseline"/>
           <w:rtl w:val="0"/>
         </w:rPr>
-        <w:t xml:space="preserve">Contribute through a feature branch and pull request to main. Keep weights, environments, generated meshes, private references and secrets out of Git. Repository protections and validation gates are described in docs/CONTRIBUTING.md.</w:t>
+        <w:t xml:space="preserve">Contribute through a feature branch and pull request to main. Keep weights, environments, generated meshes and private references out of Git. No automated status check is required; verify relevant behavior locally. See docs/CONTRIBUTING.md.</w:t>
       </w:r>
     </w:p>
     <w:sectPr>

</xml_diff>

<commit_message>
Keep the operating guide appendix on one page
</commit_message>
<xml_diff>
--- a/docs/ModelUnify_Operating_Guide.docx
+++ b/docs/ModelUnify_Operating_Guide.docx
@@ -2631,18 +2631,18 @@
         <w:rPr>
           <w:rtl w:val="0"/>
         </w:rPr>
-        <w:t xml:space="preserve">Install only the model weights required for your next operation. Keep application environments, original assets and generated outputs separate from checkpoints. Several backends use a shared Hugging Face cache; removing a cached model can affect another application that uses it.</w:t>
-      </w:r>
-    </w:p>
-    <w:p>
-      <w:pPr>
-        <w:rPr/>
-      </w:pPr>
-      <w:r>
-        <w:rPr>
-          <w:rtl w:val="0"/>
-        </w:rPr>
-        <w:t xml:space="preserve">For an installed Comfy runtime, run .venv/Scripts/python.exe -m scripts.comfyui_host download --model trellis. Alternatives are pixal, pixal-mv and all. For a fresh runtime use setup instead. Check model after installation; keep Comfy separate from the main environment.</w:t>
+        <w:t xml:space="preserve">Install only the weights needed for the next operation. Preserve application environments and user assets. Removing a shared Hugging Face checkpoint can affect other applications.</w:t>
+      </w:r>
+    </w:p>
+    <w:p>
+      <w:pPr>
+        <w:rPr/>
+      </w:pPr>
+      <w:r>
+        <w:rPr>
+          <w:rtl w:val="0"/>
+        </w:rPr>
+        <w:t xml:space="preserve">With ComfyUI installed, run .venv/Scripts/python.exe -m scripts.comfyui_host download --model trellis. Alternatives are pixal, pixal-mv and all. For a fresh runtime use setup instead. Check model afterward.</w:t>
       </w:r>
     </w:p>
     <w:p>
@@ -2850,7 +2850,7 @@
           <w:vertAlign w:val="baseline"/>
           <w:rtl w:val="0"/>
         </w:rPr>
-        <w:t xml:space="preserve">Guides: docs/INSTALLATION.md, MODEL_WEIGHTS.md, COMFYUI.md and BMS_WORKFLOW.md. Controls: scripts/workbench/schema.py and comfyui_workflows.py. Repository: github.com/AsafBSh/ModelUnity.</w:t>
+        <w:t xml:space="preserve">Guides: docs/INSTALLATION.md, MODEL_WEIGHTS.md, COMFYUI.md and BMS_WORKFLOW.md. Repository: github.com/AsafBSh/ModelUnity.</w:t>
       </w:r>
     </w:p>
     <w:p>

</xml_diff>

<commit_message>
Clean public repository and retain current user guides (#2)
* Trim public repository to application source and current user guides

* Keep the operating guide appendix on one page
</commit_message>
<xml_diff>
--- a/docs/ModelUnify_Operating_Guide.docx
+++ b/docs/ModelUnify_Operating_Guide.docx
@@ -953,7 +953,7 @@
         <w:rPr>
           <w:rtl w:val="0"/>
         </w:rPr>
-        <w:t xml:space="preserve">Version 1.11.2 source excludes AI weights. This workstation retains its environments and native extensions. Existing meshes still support inspection, manual masks, CPU optimization, UV rebaking and export. Generation, paint and learned preparation need restored weights. Fresh clones also need Python and native-extension setup.</w:t>
+        <w:t xml:space="preserve">Version 1.11.3 keeps AI weights optional. After installing the main environment, existing meshes support inspection, manual masks, CPU optimization, UV rebaking and export. Generation, paint and learned preparation need their model downloads. Fresh installations also need the native extensions before painting.</w:t>
       </w:r>
     </w:p>
     <w:bookmarkStart w:colFirst="0" w:colLast="0" w:name="bookmark=id.1sqjewf8afxt" w:id="2"/>
@@ -1143,7 +1143,7 @@
         <w:rPr>
           <w:rtl w:val="0"/>
         </w:rPr>
-        <w:t xml:space="preserve">Fresh clones need CPython 3.11 x64 and the environment setup in docs/DEVELOPMENT.md. Restore selected model weights separately. On a new machine, build native paint extensions with compatible MSVC/CUDA tools; Git excludes machine-specific binaries.</w:t>
+        <w:t xml:space="preserve">Fresh clones need CPython 3.11 x64 and the environment setup in docs/INSTALLATION.md. Restore selected model weights separately. On a new machine, build native paint extensions with compatible MSVC/CUDA tools; Git excludes machine-specific binaries.</w:t>
       </w:r>
     </w:p>
     <w:bookmarkStart w:colFirst="0" w:colLast="0" w:name="bookmark=id.xx7bxdemqiq" w:id="4"/>
@@ -1605,7 +1605,7 @@
                 <w:vertAlign w:val="baseline"/>
                 <w:rtl w:val="0"/>
               </w:rPr>
-              <w:t xml:space="preserve">Available after cleanup</w:t>
+              <w:t xml:space="preserve">Availability</w:t>
             </w:r>
             <w:r>
               <w:rPr>
@@ -2631,29 +2631,29 @@
         <w:rPr>
           <w:rtl w:val="0"/>
         </w:rPr>
-        <w:t xml:space="preserve">The 28 October cleanup removed downloaded project AI weights while retaining code, environments, native modules and user assets. It also removed the named Hunyuan, DINOv2 and Marigold shared caches. Other applications using those caches must download their weights again.</w:t>
-      </w:r>
-    </w:p>
-    <w:p>
-      <w:pPr>
-        <w:rPr/>
-      </w:pPr>
-      <w:r>
-        <w:rPr>
-          <w:rtl w:val="0"/>
-        </w:rPr>
-        <w:t xml:space="preserve">For an installed Comfy runtime, run .venv/Scripts/python.exe -m scripts.comfyui_host download --model trellis. Alternatives are pixal, pixal-mv and all. For a fresh runtime use setup instead. Check model after installation; keep Comfy separate from the main environment.</w:t>
-      </w:r>
-    </w:p>
-    <w:p>
-      <w:pPr>
-        <w:rPr/>
-      </w:pPr>
-      <w:r>
-        <w:rPr>
-          <w:rtl w:val="0"/>
-        </w:rPr>
-        <w:t xml:space="preserve">Native TripoSG/RMBG use pretrained_weights. Hunyuan, Paint and DINOv2 use the Hugging Face cache; Paint also needs RealESRGAN_x4plus.pth. docs/MODEL_WEIGHTS.md gives exact commands, paths, sizes and checks. Selecting a model does not install its weights.</w:t>
+        <w:t xml:space="preserve">Install only the weights needed for the next operation. Preserve application environments and user assets. Removing a shared Hugging Face checkpoint can affect other applications.</w:t>
+      </w:r>
+    </w:p>
+    <w:p>
+      <w:pPr>
+        <w:rPr/>
+      </w:pPr>
+      <w:r>
+        <w:rPr>
+          <w:rtl w:val="0"/>
+        </w:rPr>
+        <w:t xml:space="preserve">With ComfyUI installed, run .venv/Scripts/python.exe -m scripts.comfyui_host download --model trellis. Alternatives are pixal, pixal-mv and all. For a fresh runtime use setup instead. Check model afterward.</w:t>
+      </w:r>
+    </w:p>
+    <w:p>
+      <w:pPr>
+        <w:rPr/>
+      </w:pPr>
+      <w:r>
+        <w:rPr>
+          <w:rtl w:val="0"/>
+        </w:rPr>
+        <w:t xml:space="preserve">Native backends load TripoSG/RMBG from pretrained_weights. Hunyuan and DINO use the shared Hugging Face cache. Painting additionally requires the RealESRGAN checkpoint. See docs/MODEL_WEIGHTS.md for download commands and sizes. Selecting a model does not install it.</w:t>
       </w:r>
     </w:p>
     <w:p>
@@ -2850,7 +2850,7 @@
           <w:vertAlign w:val="baseline"/>
           <w:rtl w:val="0"/>
         </w:rPr>
-        <w:t xml:space="preserve">Sources: docs/WORKBENCH.md, ACCURACY_AUTHORING.md, COMFYUI.md, DEVELOPMENT.md and BMS_WORKFLOW.md. Controls: scripts/workbench/schema.py and comfyui_workflows.py. Repository: github.com/AsafBSh/ModelUnity.</w:t>
+        <w:t xml:space="preserve">Guides: docs/INSTALLATION.md, MODEL_WEIGHTS.md, COMFYUI.md and BMS_WORKFLOW.md. Repository: github.com/AsafBSh/ModelUnity.</w:t>
       </w:r>
     </w:p>
     <w:p>
@@ -2941,7 +2941,7 @@
           <w:vertAlign w:val="baseline"/>
           <w:rtl w:val="0"/>
         </w:rPr>
-        <w:t xml:space="preserve">Contribute through a feature branch and pull request to main. Keep weights, environments, generated meshes, private references and secrets out of Git. Repository protections and validation gates are described in docs/CONTRIBUTING.md.</w:t>
+        <w:t xml:space="preserve">Contribute through a feature branch and pull request to main. Keep weights, environments, generated meshes and private references out of Git. No automated status check is required; verify relevant behavior locally. See docs/CONTRIBUTING.md.</w:t>
       </w:r>
     </w:p>
     <w:sectPr>

</xml_diff>

<commit_message>
docs: illustrate ModelUnify workbench and guides (v1.11.4)
</commit_message>
<xml_diff>
--- a/docs/ModelUnify_Operating_Guide.docx
+++ b/docs/ModelUnify_Operating_Guide.docx
@@ -260,7 +260,7 @@
                 <w:color w:val="666666"/>
                 <w:rtl w:val="0"/>
               </w:rPr>
-              <w:t xml:space="preserve">28 October 2026</w:t>
+              <w:t xml:space="preserve">30 October 2026</w:t>
             </w:r>
           </w:p>
         </w:tc>
@@ -953,7 +953,7 @@
         <w:rPr>
           <w:rtl w:val="0"/>
         </w:rPr>
-        <w:t xml:space="preserve">Version 1.11.3 keeps AI weights optional. After installing the main environment, existing meshes support inspection, manual masks, CPU optimization, UV rebaking and export. Generation, paint and learned preparation need their model downloads. Fresh installations also need the native extensions before painting.</w:t>
+        <w:t xml:space="preserve">Version 1.11.4 keeps AI weights optional. After installing the main environment, existing meshes support inspection, manual masks, CPU optimization, UV rebaking and export. Generation, paint and learned preparation need their model downloads. Fresh installations also need the native extensions before painting.</w:t>
       </w:r>
     </w:p>
     <w:bookmarkStart w:colFirst="0" w:colLast="0" w:name="bookmark=id.1sqjewf8afxt" w:id="2"/>
@@ -2944,6 +2944,874 @@
         <w:t xml:space="preserve">Contribute through a feature branch and pull request to main. Keep weights, environments, generated meshes and private references out of Git. No automated status check is required; verify relevant behavior locally. See docs/CONTRIBUTING.md.</w:t>
       </w:r>
     </w:p>
+    <w:p>
+      <w:pPr>
+        <w:keepNext/>
+        <w:keepLines/>
+        <w:pageBreakBefore/>
+        <w:spacing w:before="0" w:after="180" w:line="259" w:lineRule="auto"/>
+      </w:pPr>
+      <w:r>
+        <w:rPr>
+          <w:rFonts w:ascii="Helvetica Neue" w:hAnsi="Helvetica Neue"/>
+          <w:b/>
+          <w:color w:val="000000"/>
+          <w:sz w:val="44"/>
+        </w:rPr>
+        <w:t>Screen tour — workbench</w:t>
+      </w:r>
+    </w:p>
+    <w:p>
+      <w:pPr>
+        <w:keepNext w:val="0"/>
+        <w:keepLines/>
+        <w:spacing w:before="0" w:after="120" w:line="259" w:lineRule="auto"/>
+      </w:pPr>
+      <w:r>
+        <w:rPr>
+          <w:rFonts w:ascii="Helvetica Neue" w:hAnsi="Helvetica Neue"/>
+          <w:b w:val="0"/>
+          <w:color w:val="000000"/>
+          <w:sz w:val="22"/>
+        </w:rPr>
+        <w:t>Actual v1.11.4 screens and previously saved assets. No new inference was run. The menus below configure operations; requested settings are not evidence that a job completed.</w:t>
+      </w:r>
+    </w:p>
+    <w:p>
+      <w:pPr>
+        <w:keepNext/>
+        <w:keepLines/>
+        <w:spacing w:before="0" w:after="100" w:line="240" w:lineRule="auto"/>
+      </w:pPr>
+      <w:r>
+        <w:rPr>
+          <w:rFonts w:ascii="Helvetica Neue" w:hAnsi="Helvetica Neue"/>
+          <w:b w:val="0"/>
+          <w:color w:val="000000"/>
+          <w:sz w:val="22"/>
+        </w:rPr>
+      </w:r>
+      <w:r>
+        <w:drawing>
+          <wp:inline>
+            <wp:extent cx="5943600" cy="3714750"/>
+            <wp:docPr id="2" name="Picture 2" descr="workbench overview — actual ModelUnify v1.11.4 screenshot"/>
+            <wp:cNvGraphicFramePr>
+              <a:graphicFrameLocks noChangeAspect="1"/>
+            </wp:cNvGraphicFramePr>
+            <a:graphic>
+              <a:graphicData uri="http://schemas.openxmlformats.org/drawingml/2006/picture">
+                <pic:pic>
+                  <pic:nvPicPr>
+                    <pic:cNvPr id="0" name="image.png"/>
+                    <pic:cNvPicPr/>
+                  </pic:nvPicPr>
+                  <pic:blipFill>
+                    <a:blip r:embed="rId6"/>
+                    <a:stretch>
+                      <a:fillRect/>
+                    </a:stretch>
+                  </pic:blipFill>
+                  <pic:spPr>
+                    <a:xfrm>
+                      <a:off x="0" y="0"/>
+                      <a:ext cx="5943600" cy="3714750"/>
+                    </a:xfrm>
+                    <a:prstGeom prst="rect"/>
+                  </pic:spPr>
+                </pic:pic>
+              </a:graphicData>
+            </a:graphic>
+          </wp:inline>
+        </w:drawing>
+      </w:r>
+    </w:p>
+    <w:p>
+      <w:pPr>
+        <w:keepNext w:val="0"/>
+        <w:keepLines/>
+        <w:spacing w:before="0" w:after="200" w:line="259" w:lineRule="auto"/>
+      </w:pPr>
+      <w:r>
+        <w:rPr>
+          <w:rFonts w:ascii="Helvetica Neue" w:hAnsi="Helvetica Neue"/>
+          <w:b w:val="0"/>
+          <w:color w:val="000000"/>
+          <w:sz w:val="22"/>
+        </w:rPr>
+        <w:t>One viewport, five workflow stages. Settings scroll on the left; inspectors scroll on the right. Texture shows the building’s actual embedded albedo. Drag a divider to resize either panel.</w:t>
+      </w:r>
+    </w:p>
+    <w:p>
+      <w:pPr>
+        <w:keepNext/>
+        <w:keepLines/>
+        <w:spacing w:before="0" w:after="100" w:line="240" w:lineRule="auto"/>
+      </w:pPr>
+      <w:r>
+        <w:rPr>
+          <w:rFonts w:ascii="Helvetica Neue" w:hAnsi="Helvetica Neue"/>
+          <w:b w:val="0"/>
+          <w:color w:val="000000"/>
+          <w:sz w:val="22"/>
+        </w:rPr>
+      </w:r>
+      <w:r>
+        <w:drawing>
+          <wp:inline>
+            <wp:extent cx="2880360" cy="1529991"/>
+            <wp:docPr id="3" name="Picture 3" descr="example tank — actual ModelUnify v1.11.4 screenshot"/>
+            <wp:cNvGraphicFramePr>
+              <a:graphicFrameLocks noChangeAspect="1"/>
+            </wp:cNvGraphicFramePr>
+            <a:graphic>
+              <a:graphicData uri="http://schemas.openxmlformats.org/drawingml/2006/picture">
+                <pic:pic>
+                  <pic:nvPicPr>
+                    <pic:cNvPr id="0" name="image.png"/>
+                    <pic:cNvPicPr/>
+                  </pic:nvPicPr>
+                  <pic:blipFill>
+                    <a:blip r:embed="rId11"/>
+                    <a:stretch>
+                      <a:fillRect/>
+                    </a:stretch>
+                  </pic:blipFill>
+                  <pic:spPr>
+                    <a:xfrm>
+                      <a:off x="0" y="0"/>
+                      <a:ext cx="2880360" cy="1529991"/>
+                    </a:xfrm>
+                    <a:prstGeom prst="rect"/>
+                  </pic:spPr>
+                </pic:pic>
+              </a:graphicData>
+            </a:graphic>
+          </wp:inline>
+        </w:drawing>
+      </w:r>
+      <w:r>
+        <w:t xml:space="preserve">  </w:t>
+      </w:r>
+      <w:r>
+        <w:drawing>
+          <wp:inline>
+            <wp:extent cx="2880360" cy="1529991"/>
+            <wp:docPr id="4" name="Picture 4" descr="example jet — actual ModelUnify v1.11.4 screenshot"/>
+            <wp:cNvGraphicFramePr>
+              <a:graphicFrameLocks noChangeAspect="1"/>
+            </wp:cNvGraphicFramePr>
+            <a:graphic>
+              <a:graphicData uri="http://schemas.openxmlformats.org/drawingml/2006/picture">
+                <pic:pic>
+                  <pic:nvPicPr>
+                    <pic:cNvPr id="0" name="image.png"/>
+                    <pic:cNvPicPr/>
+                  </pic:nvPicPr>
+                  <pic:blipFill>
+                    <a:blip r:embed="rId12"/>
+                    <a:stretch>
+                      <a:fillRect/>
+                    </a:stretch>
+                  </pic:blipFill>
+                  <pic:spPr>
+                    <a:xfrm>
+                      <a:off x="0" y="0"/>
+                      <a:ext cx="2880360" cy="1529991"/>
+                    </a:xfrm>
+                    <a:prstGeom prst="rect"/>
+                  </pic:spPr>
+                </pic:pic>
+              </a:graphicData>
+            </a:graphic>
+          </wp:inline>
+        </w:drawing>
+      </w:r>
+    </w:p>
+    <w:p>
+      <w:pPr>
+        <w:keepNext w:val="0"/>
+        <w:keepLines/>
+        <w:spacing w:before="0" w:after="120" w:line="259" w:lineRule="auto"/>
+      </w:pPr>
+      <w:r>
+        <w:rPr>
+          <w:rFonts w:ascii="Helvetica Neue" w:hAnsi="Helvetica Neue"/>
+          <w:b w:val="0"/>
+          <w:color w:val="000000"/>
+          <w:sz w:val="22"/>
+        </w:rPr>
+        <w:t>Saved examples: textured tank (left, 40,000 triangles) and TRELLIS.2 jet shape (right, about 20,000 triangles, no UVs or textures). Inspect thin parts and dimensions before use; these are static meshes, not game-ready vehicles.</w:t>
+      </w:r>
+    </w:p>
+    <w:p>
+      <w:pPr>
+        <w:keepNext/>
+        <w:keepLines/>
+        <w:pageBreakBefore/>
+        <w:spacing w:before="0" w:after="180" w:line="259" w:lineRule="auto"/>
+      </w:pPr>
+      <w:r>
+        <w:rPr>
+          <w:rFonts w:ascii="Helvetica Neue" w:hAnsi="Helvetica Neue"/>
+          <w:b/>
+          <w:color w:val="000000"/>
+          <w:sz w:val="44"/>
+        </w:rPr>
+        <w:t>Inputs and single-view generation</w:t>
+      </w:r>
+    </w:p>
+    <w:p>
+      <w:pPr>
+        <w:keepNext w:val="0"/>
+        <w:keepLines/>
+        <w:spacing w:before="0" w:after="120" w:line="259" w:lineRule="auto"/>
+      </w:pPr>
+      <w:r>
+        <w:rPr>
+          <w:rFonts w:ascii="Helvetica Neue" w:hAnsi="Helvetica Neue"/>
+          <w:b w:val="0"/>
+          <w:color w:val="000000"/>
+          <w:sz w:val="22"/>
+        </w:rPr>
+        <w:t>The hangar is an earlier Hunyuan result. Changing the selected backend leaves that saved preview in place until a new generation job completes.</w:t>
+      </w:r>
+    </w:p>
+    <w:p>
+      <w:pPr>
+        <w:keepNext/>
+        <w:keepLines/>
+        <w:spacing w:before="0" w:after="100" w:line="240" w:lineRule="auto"/>
+      </w:pPr>
+      <w:r>
+        <w:rPr>
+          <w:rFonts w:ascii="Helvetica Neue" w:hAnsi="Helvetica Neue"/>
+          <w:b w:val="0"/>
+          <w:color w:val="000000"/>
+          <w:sz w:val="22"/>
+        </w:rPr>
+      </w:r>
+      <w:r>
+        <w:drawing>
+          <wp:inline>
+            <wp:extent cx="2880360" cy="5082988"/>
+            <wp:docPr id="5" name="Picture 5" descr="inputs hunyuan multiview — actual ModelUnify v1.11.4 screenshot"/>
+            <wp:cNvGraphicFramePr>
+              <a:graphicFrameLocks noChangeAspect="1"/>
+            </wp:cNvGraphicFramePr>
+            <a:graphic>
+              <a:graphicData uri="http://schemas.openxmlformats.org/drawingml/2006/picture">
+                <pic:pic>
+                  <pic:nvPicPr>
+                    <pic:cNvPr id="0" name="image.png"/>
+                    <pic:cNvPicPr/>
+                  </pic:nvPicPr>
+                  <pic:blipFill>
+                    <a:blip r:embed="rId13"/>
+                    <a:stretch>
+                      <a:fillRect/>
+                    </a:stretch>
+                  </pic:blipFill>
+                  <pic:spPr>
+                    <a:xfrm>
+                      <a:off x="0" y="0"/>
+                      <a:ext cx="2880360" cy="5082988"/>
+                    </a:xfrm>
+                    <a:prstGeom prst="rect"/>
+                  </pic:spPr>
+                </pic:pic>
+              </a:graphicData>
+            </a:graphic>
+          </wp:inline>
+        </w:drawing>
+      </w:r>
+      <w:r>
+        <w:t xml:space="preserve">  </w:t>
+      </w:r>
+      <w:r>
+        <w:drawing>
+          <wp:inline>
+            <wp:extent cx="2880360" cy="5082988"/>
+            <wp:docPr id="6" name="Picture 6" descr="generate triposg — actual ModelUnify v1.11.4 screenshot"/>
+            <wp:cNvGraphicFramePr>
+              <a:graphicFrameLocks noChangeAspect="1"/>
+            </wp:cNvGraphicFramePr>
+            <a:graphic>
+              <a:graphicData uri="http://schemas.openxmlformats.org/drawingml/2006/picture">
+                <pic:pic>
+                  <pic:nvPicPr>
+                    <pic:cNvPr id="0" name="image.png"/>
+                    <pic:cNvPicPr/>
+                  </pic:nvPicPr>
+                  <pic:blipFill>
+                    <a:blip r:embed="rId14"/>
+                    <a:stretch>
+                      <a:fillRect/>
+                    </a:stretch>
+                  </pic:blipFill>
+                  <pic:spPr>
+                    <a:xfrm>
+                      <a:off x="0" y="0"/>
+                      <a:ext cx="2880360" cy="5082988"/>
+                    </a:xfrm>
+                    <a:prstGeom prst="rect"/>
+                  </pic:spPr>
+                </pic:pic>
+              </a:graphicData>
+            </a:graphic>
+          </wp:inline>
+        </w:drawing>
+      </w:r>
+    </w:p>
+    <w:p>
+      <w:pPr>
+        <w:keepNext w:val="0"/>
+        <w:keepLines/>
+        <w:spacing w:before="0" w:after="120" w:line="259" w:lineRule="auto"/>
+      </w:pPr>
+      <w:r>
+        <w:rPr>
+          <w:rFonts w:ascii="Helvetica Neue" w:hAnsi="Helvetica Neue"/>
+          <w:b w:val="0"/>
+          <w:color w:val="000000"/>
+          <w:sz w:val="21"/>
+        </w:rPr>
+        <w:t>Left — Hunyuan3D-2mv: Front, Left, Back and Right show the saved reference set. Scroll to background removal, cropping and mask correction. This untextured shape still needs openings and topology review.</w:t>
+      </w:r>
+    </w:p>
+    <w:p>
+      <w:pPr>
+        <w:keepNext w:val="0"/>
+        <w:keepLines/>
+        <w:spacing w:before="0" w:after="120" w:line="259" w:lineRule="auto"/>
+      </w:pPr>
+      <w:r>
+        <w:rPr>
+          <w:rFonts w:ascii="Helvetica Neue" w:hAnsi="Helvetica Neue"/>
+          <w:b w:val="0"/>
+          <w:color w:val="000000"/>
+          <w:sz w:val="21"/>
+        </w:rPr>
+        <w:t>Right — TripoSG: only one input is shown. Hidden directions are not fused. Check the model information, choose settings and queue Generate mesh to create a new candidate.</w:t>
+      </w:r>
+    </w:p>
+    <w:p>
+      <w:pPr>
+        <w:keepNext w:val="0"/>
+        <w:keepLines/>
+        <w:spacing w:before="0" w:after="120" w:line="259" w:lineRule="auto"/>
+      </w:pPr>
+      <w:r>
+        <w:rPr>
+          <w:rFonts w:ascii="Helvetica Neue" w:hAnsi="Helvetica Neue"/>
+          <w:b w:val="0"/>
+          <w:color w:val="000000"/>
+          <w:sz w:val="21"/>
+        </w:rPr>
+        <w:t>Panel crops from the actual app. Scroll inside each panel to reach the remaining controls; full-window images are available in the Markdown operating guide.</w:t>
+      </w:r>
+    </w:p>
+    <w:p>
+      <w:pPr>
+        <w:keepNext/>
+        <w:keepLines/>
+        <w:pageBreakBefore/>
+        <w:spacing w:before="0" w:after="180" w:line="259" w:lineRule="auto"/>
+      </w:pPr>
+      <w:r>
+        <w:rPr>
+          <w:rFonts w:ascii="Helvetica Neue" w:hAnsi="Helvetica Neue"/>
+          <w:b/>
+          <w:color w:val="000000"/>
+          <w:sz w:val="44"/>
+        </w:rPr>
+        <w:t>Advanced generation settings</w:t>
+      </w:r>
+    </w:p>
+    <w:p>
+      <w:pPr>
+        <w:keepNext w:val="0"/>
+        <w:keepLines/>
+        <w:spacing w:before="0" w:after="120" w:line="259" w:lineRule="auto"/>
+      </w:pPr>
+      <w:r>
+        <w:rPr>
+          <w:rFonts w:ascii="Helvetica Neue" w:hAnsi="Helvetica Neue"/>
+          <w:b w:val="0"/>
+          <w:color w:val="000000"/>
+          <w:sz w:val="22"/>
+        </w:rPr>
+        <w:t>Scroll inside the settings panel for these controls. Higher values increase work and memory use; they do not establish geometric accuracy.</w:t>
+      </w:r>
+    </w:p>
+    <w:p>
+      <w:pPr>
+        <w:keepNext/>
+        <w:keepLines/>
+        <w:spacing w:before="0" w:after="100" w:line="240" w:lineRule="auto"/>
+      </w:pPr>
+      <w:r>
+        <w:rPr>
+          <w:rFonts w:ascii="Helvetica Neue" w:hAnsi="Helvetica Neue"/>
+          <w:b w:val="0"/>
+          <w:color w:val="000000"/>
+          <w:sz w:val="22"/>
+        </w:rPr>
+      </w:r>
+      <w:r>
+        <w:drawing>
+          <wp:inline>
+            <wp:extent cx="2880360" cy="5082988"/>
+            <wp:docPr id="7" name="Picture 7" descr="generate hunyuan — actual ModelUnify v1.11.4 screenshot"/>
+            <wp:cNvGraphicFramePr>
+              <a:graphicFrameLocks noChangeAspect="1"/>
+            </wp:cNvGraphicFramePr>
+            <a:graphic>
+              <a:graphicData uri="http://schemas.openxmlformats.org/drawingml/2006/picture">
+                <pic:pic>
+                  <pic:nvPicPr>
+                    <pic:cNvPr id="0" name="image.png"/>
+                    <pic:cNvPicPr/>
+                  </pic:nvPicPr>
+                  <pic:blipFill>
+                    <a:blip r:embed="rId15"/>
+                    <a:stretch>
+                      <a:fillRect/>
+                    </a:stretch>
+                  </pic:blipFill>
+                  <pic:spPr>
+                    <a:xfrm>
+                      <a:off x="0" y="0"/>
+                      <a:ext cx="2880360" cy="5082988"/>
+                    </a:xfrm>
+                    <a:prstGeom prst="rect"/>
+                  </pic:spPr>
+                </pic:pic>
+              </a:graphicData>
+            </a:graphic>
+          </wp:inline>
+        </w:drawing>
+      </w:r>
+      <w:r>
+        <w:t xml:space="preserve">  </w:t>
+      </w:r>
+      <w:r>
+        <w:drawing>
+          <wp:inline>
+            <wp:extent cx="2880360" cy="5082988"/>
+            <wp:docPr id="8" name="Picture 8" descr="generate comfyui — actual ModelUnify v1.11.4 screenshot"/>
+            <wp:cNvGraphicFramePr>
+              <a:graphicFrameLocks noChangeAspect="1"/>
+            </wp:cNvGraphicFramePr>
+            <a:graphic>
+              <a:graphicData uri="http://schemas.openxmlformats.org/drawingml/2006/picture">
+                <pic:pic>
+                  <pic:nvPicPr>
+                    <pic:cNvPr id="0" name="image.png"/>
+                    <pic:cNvPicPr/>
+                  </pic:nvPicPr>
+                  <pic:blipFill>
+                    <a:blip r:embed="rId16"/>
+                    <a:stretch>
+                      <a:fillRect/>
+                    </a:stretch>
+                  </pic:blipFill>
+                  <pic:spPr>
+                    <a:xfrm>
+                      <a:off x="0" y="0"/>
+                      <a:ext cx="2880360" cy="5082988"/>
+                    </a:xfrm>
+                    <a:prstGeom prst="rect"/>
+                  </pic:spPr>
+                </pic:pic>
+              </a:graphicData>
+            </a:graphic>
+          </wp:inline>
+        </w:drawing>
+      </w:r>
+    </w:p>
+    <w:p>
+      <w:pPr>
+        <w:keepNext w:val="0"/>
+        <w:keepLines/>
+        <w:spacing w:before="0" w:after="120" w:line="259" w:lineRule="auto"/>
+      </w:pPr>
+      <w:r>
+        <w:rPr>
+          <w:rFonts w:ascii="Helvetica Neue" w:hAnsi="Helvetica Neue"/>
+          <w:b w:val="0"/>
+          <w:color w:val="000000"/>
+          <w:sz w:val="21"/>
+        </w:rPr>
+        <w:t>Left — Hunyuan: diffusion steps, extraction resolution, guidance, decoder chunks and marching-cubes level. Resolution is distinct from TripoSG’s octree depth. Preserve and compare the raw result.</w:t>
+      </w:r>
+    </w:p>
+    <w:p>
+      <w:pPr>
+        <w:keepNext w:val="0"/>
+        <w:keepLines/>
+        <w:spacing w:before="0" w:after="120" w:line="259" w:lineRule="auto"/>
+      </w:pPr>
+      <w:r>
+        <w:rPr>
+          <w:rFonts w:ascii="Helvetica Neue" w:hAnsi="Helvetica Neue"/>
+          <w:b w:val="0"/>
+          <w:color w:val="000000"/>
+          <w:sz w:val="21"/>
+        </w:rPr>
+        <w:t>Right — Pixal3D: fixed-orbit multiview requires separate weights and matched views at 90-degree intervals. Shape resolution, working-mesh cleanup and PBR atlas are independent. Restore weights and check the isolated Comfy host before generating.</w:t>
+      </w:r>
+    </w:p>
+    <w:p>
+      <w:pPr>
+        <w:keepNext w:val="0"/>
+        <w:keepLines/>
+        <w:spacing w:before="0" w:after="120" w:line="259" w:lineRule="auto"/>
+      </w:pPr>
+      <w:r>
+        <w:rPr>
+          <w:rFonts w:ascii="Helvetica Neue" w:hAnsi="Helvetica Neue"/>
+          <w:b w:val="0"/>
+          <w:color w:val="000000"/>
+          <w:sz w:val="21"/>
+        </w:rPr>
+        <w:t>Panel crops from the actual app. Scroll inside each panel to reach the remaining controls; full-window images are available in the Markdown operating guide.</w:t>
+      </w:r>
+    </w:p>
+    <w:p>
+      <w:pPr>
+        <w:keepNext/>
+        <w:keepLines/>
+        <w:pageBreakBefore/>
+        <w:spacing w:before="0" w:after="180" w:line="259" w:lineRule="auto"/>
+      </w:pPr>
+      <w:r>
+        <w:rPr>
+          <w:rFonts w:ascii="Helvetica Neue" w:hAnsi="Helvetica Neue"/>
+          <w:b/>
+          <w:color w:val="000000"/>
+          <w:sz w:val="44"/>
+        </w:rPr>
+        <w:t>Optimization and texture inspection</w:t>
+      </w:r>
+    </w:p>
+    <w:p>
+      <w:pPr>
+        <w:keepNext w:val="0"/>
+        <w:keepLines/>
+        <w:spacing w:before="0" w:after="120" w:line="259" w:lineRule="auto"/>
+      </w:pPr>
+      <w:r>
+        <w:rPr>
+          <w:rFonts w:ascii="Helvetica Neue" w:hAnsi="Helvetica Neue"/>
+          <w:b w:val="0"/>
+          <w:color w:val="000000"/>
+          <w:sz w:val="22"/>
+        </w:rPr>
+        <w:t>Inspect the currently displayed GLB before making another working copy. Existing materials and geometry remain the reference for review.</w:t>
+      </w:r>
+    </w:p>
+    <w:p>
+      <w:pPr>
+        <w:keepNext/>
+        <w:keepLines/>
+        <w:spacing w:before="0" w:after="100" w:line="240" w:lineRule="auto"/>
+      </w:pPr>
+      <w:r>
+        <w:rPr>
+          <w:rFonts w:ascii="Helvetica Neue" w:hAnsi="Helvetica Neue"/>
+          <w:b w:val="0"/>
+          <w:color w:val="000000"/>
+          <w:sz w:val="22"/>
+        </w:rPr>
+      </w:r>
+      <w:r>
+        <w:drawing>
+          <wp:inline>
+            <wp:extent cx="2880360" cy="5082988"/>
+            <wp:docPr id="9" name="Picture 9" descr="optimize — actual ModelUnify v1.11.4 screenshot"/>
+            <wp:cNvGraphicFramePr>
+              <a:graphicFrameLocks noChangeAspect="1"/>
+            </wp:cNvGraphicFramePr>
+            <a:graphic>
+              <a:graphicData uri="http://schemas.openxmlformats.org/drawingml/2006/picture">
+                <pic:pic>
+                  <pic:nvPicPr>
+                    <pic:cNvPr id="0" name="image.png"/>
+                    <pic:cNvPicPr/>
+                  </pic:nvPicPr>
+                  <pic:blipFill>
+                    <a:blip r:embed="rId17"/>
+                    <a:stretch>
+                      <a:fillRect/>
+                    </a:stretch>
+                  </pic:blipFill>
+                  <pic:spPr>
+                    <a:xfrm>
+                      <a:off x="0" y="0"/>
+                      <a:ext cx="2880360" cy="5082988"/>
+                    </a:xfrm>
+                    <a:prstGeom prst="rect"/>
+                  </pic:spPr>
+                </pic:pic>
+              </a:graphicData>
+            </a:graphic>
+          </wp:inline>
+        </w:drawing>
+      </w:r>
+      <w:r>
+        <w:t xml:space="preserve">  </w:t>
+      </w:r>
+      <w:r>
+        <w:drawing>
+          <wp:inline>
+            <wp:extent cx="2880360" cy="5080247"/>
+            <wp:docPr id="10" name="Picture 10" descr="texture inspector — actual ModelUnify v1.11.4 screenshot"/>
+            <wp:cNvGraphicFramePr>
+              <a:graphicFrameLocks noChangeAspect="1"/>
+            </wp:cNvGraphicFramePr>
+            <a:graphic>
+              <a:graphicData uri="http://schemas.openxmlformats.org/drawingml/2006/picture">
+                <pic:pic>
+                  <pic:nvPicPr>
+                    <pic:cNvPr id="0" name="image.png"/>
+                    <pic:cNvPicPr/>
+                  </pic:nvPicPr>
+                  <pic:blipFill>
+                    <a:blip r:embed="rId18"/>
+                    <a:stretch>
+                      <a:fillRect/>
+                    </a:stretch>
+                  </pic:blipFill>
+                  <pic:spPr>
+                    <a:xfrm>
+                      <a:off x="0" y="0"/>
+                      <a:ext cx="2880360" cy="5080247"/>
+                    </a:xfrm>
+                    <a:prstGeom prst="rect"/>
+                  </pic:spPr>
+                </pic:pic>
+              </a:graphicData>
+            </a:graphic>
+          </wp:inline>
+        </w:drawing>
+      </w:r>
+    </w:p>
+    <w:p>
+      <w:pPr>
+        <w:keepNext w:val="0"/>
+        <w:keepLines/>
+        <w:spacing w:before="0" w:after="120" w:line="259" w:lineRule="auto"/>
+      </w:pPr>
+      <w:r>
+        <w:rPr>
+          <w:rFonts w:ascii="Helvetica Neue" w:hAnsi="Helvetica Neue"/>
+          <w:b w:val="0"/>
+          <w:color w:val="000000"/>
+          <w:sz w:val="21"/>
+        </w:rPr>
+        <w:t>Left — Optimize: the 8,000-triangle field is a target, not the current count. Review safeguards, achieved counts and thin parts before accepting a result.</w:t>
+      </w:r>
+    </w:p>
+    <w:p>
+      <w:pPr>
+        <w:keepNext w:val="0"/>
+        <w:keepLines/>
+        <w:spacing w:before="0" w:after="120" w:line="259" w:lineRule="auto"/>
+      </w:pPr>
+      <w:r>
+        <w:rPr>
+          <w:rFonts w:ascii="Helvetica Neue" w:hAnsi="Helvetica Neue"/>
+          <w:b w:val="0"/>
+          <w:color w:val="000000"/>
+          <w:sz w:val="21"/>
+        </w:rPr>
+        <w:t>Right — Texture inspector: the right panel shows pixels already embedded in the building. Inspect material above the viewport isolates available channels. Painting controls are in the Texture stage.</w:t>
+      </w:r>
+    </w:p>
+    <w:p>
+      <w:pPr>
+        <w:keepNext w:val="0"/>
+        <w:keepLines/>
+        <w:spacing w:before="0" w:after="120" w:line="259" w:lineRule="auto"/>
+      </w:pPr>
+      <w:r>
+        <w:rPr>
+          <w:rFonts w:ascii="Helvetica Neue" w:hAnsi="Helvetica Neue"/>
+          <w:b w:val="0"/>
+          <w:color w:val="000000"/>
+          <w:sz w:val="21"/>
+        </w:rPr>
+        <w:t>Panel crops from the actual app. Scroll inside each panel to reach the remaining controls; full-window images are available in the Markdown operating guide.</w:t>
+      </w:r>
+    </w:p>
+    <w:p>
+      <w:pPr>
+        <w:keepNext/>
+        <w:keepLines/>
+        <w:pageBreakBefore/>
+        <w:spacing w:before="0" w:after="180" w:line="259" w:lineRule="auto"/>
+      </w:pPr>
+      <w:r>
+        <w:rPr>
+          <w:rFonts w:ascii="Helvetica Neue" w:hAnsi="Helvetica Neue"/>
+          <w:b/>
+          <w:color w:val="000000"/>
+          <w:sz w:val="44"/>
+        </w:rPr>
+        <w:t>LOD export and static BMS handoff</w:t>
+      </w:r>
+    </w:p>
+    <w:p>
+      <w:pPr>
+        <w:keepNext w:val="0"/>
+        <w:keepLines/>
+        <w:spacing w:before="0" w:after="120" w:line="259" w:lineRule="auto"/>
+      </w:pPr>
+      <w:r>
+        <w:rPr>
+          <w:rFonts w:ascii="Helvetica Neue" w:hAnsi="Helvetica Neue"/>
+          <w:b w:val="0"/>
+          <w:color w:val="000000"/>
+          <w:sz w:val="22"/>
+        </w:rPr>
+        <w:t>These screens show export configuration. Inspect actual output LODs and keep reports with the package; no export or deployment was run for these pictures.</w:t>
+      </w:r>
+    </w:p>
+    <w:p>
+      <w:pPr>
+        <w:keepNext/>
+        <w:keepLines/>
+        <w:spacing w:before="0" w:after="100" w:line="240" w:lineRule="auto"/>
+      </w:pPr>
+      <w:r>
+        <w:rPr>
+          <w:rFonts w:ascii="Helvetica Neue" w:hAnsi="Helvetica Neue"/>
+          <w:b w:val="0"/>
+          <w:color w:val="000000"/>
+          <w:sz w:val="22"/>
+        </w:rPr>
+      </w:r>
+      <w:r>
+        <w:drawing>
+          <wp:inline>
+            <wp:extent cx="2880360" cy="5082988"/>
+            <wp:docPr id="11" name="Picture 11" descr="export lods — actual ModelUnify v1.11.4 screenshot"/>
+            <wp:cNvGraphicFramePr>
+              <a:graphicFrameLocks noChangeAspect="1"/>
+            </wp:cNvGraphicFramePr>
+            <a:graphic>
+              <a:graphicData uri="http://schemas.openxmlformats.org/drawingml/2006/picture">
+                <pic:pic>
+                  <pic:nvPicPr>
+                    <pic:cNvPr id="0" name="image.png"/>
+                    <pic:cNvPicPr/>
+                  </pic:nvPicPr>
+                  <pic:blipFill>
+                    <a:blip r:embed="rId19"/>
+                    <a:stretch>
+                      <a:fillRect/>
+                    </a:stretch>
+                  </pic:blipFill>
+                  <pic:spPr>
+                    <a:xfrm>
+                      <a:off x="0" y="0"/>
+                      <a:ext cx="2880360" cy="5082988"/>
+                    </a:xfrm>
+                    <a:prstGeom prst="rect"/>
+                  </pic:spPr>
+                </pic:pic>
+              </a:graphicData>
+            </a:graphic>
+          </wp:inline>
+        </w:drawing>
+      </w:r>
+      <w:r>
+        <w:t xml:space="preserve">  </w:t>
+      </w:r>
+      <w:r>
+        <w:drawing>
+          <wp:inline>
+            <wp:extent cx="2880360" cy="5082988"/>
+            <wp:docPr id="12" name="Picture 12" descr="export bms — actual ModelUnify v1.11.4 screenshot"/>
+            <wp:cNvGraphicFramePr>
+              <a:graphicFrameLocks noChangeAspect="1"/>
+            </wp:cNvGraphicFramePr>
+            <a:graphic>
+              <a:graphicData uri="http://schemas.openxmlformats.org/drawingml/2006/picture">
+                <pic:pic>
+                  <pic:nvPicPr>
+                    <pic:cNvPr id="0" name="image.png"/>
+                    <pic:cNvPicPr/>
+                  </pic:nvPicPr>
+                  <pic:blipFill>
+                    <a:blip r:embed="rId20"/>
+                    <a:stretch>
+                      <a:fillRect/>
+                    </a:stretch>
+                  </pic:blipFill>
+                  <pic:spPr>
+                    <a:xfrm>
+                      <a:off x="0" y="0"/>
+                      <a:ext cx="2880360" cy="5082988"/>
+                    </a:xfrm>
+                    <a:prstGeom prst="rect"/>
+                  </pic:spPr>
+                </pic:pic>
+              </a:graphicData>
+            </a:graphic>
+          </wp:inline>
+        </w:drawing>
+      </w:r>
+    </w:p>
+    <w:p>
+      <w:pPr>
+        <w:keepNext w:val="0"/>
+        <w:keepLines/>
+        <w:spacing w:before="0" w:after="120" w:line="259" w:lineRule="auto"/>
+      </w:pPr>
+      <w:r>
+        <w:rPr>
+          <w:rFonts w:ascii="Helvetica Neue" w:hAnsi="Helvetica Neue"/>
+          <w:b w:val="0"/>
+          <w:color w:val="000000"/>
+          <w:sz w:val="21"/>
+        </w:rPr>
+        <w:t>Left — Export: choose 1 to 7 decreasing LOD budgets and shared textures where UVs are valid. Scroll for planning distances and measured scale. Download the complete package so relative material paths stay together.</w:t>
+      </w:r>
+    </w:p>
+    <w:p>
+      <w:pPr>
+        <w:keepNext w:val="0"/>
+        <w:keepLines/>
+        <w:spacing w:before="0" w:after="120" w:line="259" w:lineRule="auto"/>
+      </w:pPr>
+      <w:r>
+        <w:rPr>
+          <w:rFonts w:ascii="Helvetica Neue" w:hAnsi="Helvetica Neue"/>
+          <w:b w:val="0"/>
+          <w:color w:val="000000"/>
+          <w:sz w:val="21"/>
+        </w:rPr>
+        <w:t>Right — General interchange / BMS handoff: optional static sidecars include material, MTI and Parent.dat data. Verify signed axes and physical scale. BML/DDS conversion, slot reconciliation, registration and in-game checks remain external.</w:t>
+      </w:r>
+    </w:p>
+    <w:p>
+      <w:pPr>
+        <w:keepNext w:val="0"/>
+        <w:keepLines/>
+        <w:spacing w:before="0" w:after="120" w:line="259" w:lineRule="auto"/>
+      </w:pPr>
+      <w:r>
+        <w:rPr>
+          <w:rFonts w:ascii="Helvetica Neue" w:hAnsi="Helvetica Neue"/>
+          <w:b w:val="0"/>
+          <w:color w:val="000000"/>
+          <w:sz w:val="21"/>
+        </w:rPr>
+        <w:t>Panel crops from the actual app. Scroll inside each panel to reach the remaining controls; full-window images are available in the Markdown operating guide.</w:t>
+      </w:r>
+    </w:p>
     <w:sectPr>
       <w:headerReference r:id="rId9" w:type="default"/>
       <w:footerReference r:id="rId10" w:type="default"/>
@@ -3207,7 +4075,7 @@
                   <w:szCs w:val="17"/>
                   <w:rtl w:val="0"/>
                 </w:rPr>
-                <w:t xml:space="preserve">28 October 2026</w:t>
+                <w:t xml:space="preserve">30 October 2026</w:t>
               </w:r>
             </w:p>
           </w:tc>

</xml_diff>

<commit_message>
docs: illustrate ModelUnify workbench and guides (v1.11.4) (#3)
</commit_message>
<xml_diff>
--- a/docs/ModelUnify_Operating_Guide.docx
+++ b/docs/ModelUnify_Operating_Guide.docx
@@ -260,7 +260,7 @@
                 <w:color w:val="666666"/>
                 <w:rtl w:val="0"/>
               </w:rPr>
-              <w:t xml:space="preserve">28 October 2026</w:t>
+              <w:t xml:space="preserve">30 October 2026</w:t>
             </w:r>
           </w:p>
         </w:tc>
@@ -953,7 +953,7 @@
         <w:rPr>
           <w:rtl w:val="0"/>
         </w:rPr>
-        <w:t xml:space="preserve">Version 1.11.3 keeps AI weights optional. After installing the main environment, existing meshes support inspection, manual masks, CPU optimization, UV rebaking and export. Generation, paint and learned preparation need their model downloads. Fresh installations also need the native extensions before painting.</w:t>
+        <w:t xml:space="preserve">Version 1.11.4 keeps AI weights optional. After installing the main environment, existing meshes support inspection, manual masks, CPU optimization, UV rebaking and export. Generation, paint and learned preparation need their model downloads. Fresh installations also need the native extensions before painting.</w:t>
       </w:r>
     </w:p>
     <w:bookmarkStart w:colFirst="0" w:colLast="0" w:name="bookmark=id.1sqjewf8afxt" w:id="2"/>
@@ -2944,6 +2944,874 @@
         <w:t xml:space="preserve">Contribute through a feature branch and pull request to main. Keep weights, environments, generated meshes and private references out of Git. No automated status check is required; verify relevant behavior locally. See docs/CONTRIBUTING.md.</w:t>
       </w:r>
     </w:p>
+    <w:p>
+      <w:pPr>
+        <w:keepNext/>
+        <w:keepLines/>
+        <w:pageBreakBefore/>
+        <w:spacing w:before="0" w:after="180" w:line="259" w:lineRule="auto"/>
+      </w:pPr>
+      <w:r>
+        <w:rPr>
+          <w:rFonts w:ascii="Helvetica Neue" w:hAnsi="Helvetica Neue"/>
+          <w:b/>
+          <w:color w:val="000000"/>
+          <w:sz w:val="44"/>
+        </w:rPr>
+        <w:t>Screen tour — workbench</w:t>
+      </w:r>
+    </w:p>
+    <w:p>
+      <w:pPr>
+        <w:keepNext w:val="0"/>
+        <w:keepLines/>
+        <w:spacing w:before="0" w:after="120" w:line="259" w:lineRule="auto"/>
+      </w:pPr>
+      <w:r>
+        <w:rPr>
+          <w:rFonts w:ascii="Helvetica Neue" w:hAnsi="Helvetica Neue"/>
+          <w:b w:val="0"/>
+          <w:color w:val="000000"/>
+          <w:sz w:val="22"/>
+        </w:rPr>
+        <w:t>Actual v1.11.4 screens and previously saved assets. No new inference was run. The menus below configure operations; requested settings are not evidence that a job completed.</w:t>
+      </w:r>
+    </w:p>
+    <w:p>
+      <w:pPr>
+        <w:keepNext/>
+        <w:keepLines/>
+        <w:spacing w:before="0" w:after="100" w:line="240" w:lineRule="auto"/>
+      </w:pPr>
+      <w:r>
+        <w:rPr>
+          <w:rFonts w:ascii="Helvetica Neue" w:hAnsi="Helvetica Neue"/>
+          <w:b w:val="0"/>
+          <w:color w:val="000000"/>
+          <w:sz w:val="22"/>
+        </w:rPr>
+      </w:r>
+      <w:r>
+        <w:drawing>
+          <wp:inline>
+            <wp:extent cx="5943600" cy="3714750"/>
+            <wp:docPr id="2" name="Picture 2" descr="workbench overview — actual ModelUnify v1.11.4 screenshot"/>
+            <wp:cNvGraphicFramePr>
+              <a:graphicFrameLocks noChangeAspect="1"/>
+            </wp:cNvGraphicFramePr>
+            <a:graphic>
+              <a:graphicData uri="http://schemas.openxmlformats.org/drawingml/2006/picture">
+                <pic:pic>
+                  <pic:nvPicPr>
+                    <pic:cNvPr id="0" name="image.png"/>
+                    <pic:cNvPicPr/>
+                  </pic:nvPicPr>
+                  <pic:blipFill>
+                    <a:blip r:embed="rId6"/>
+                    <a:stretch>
+                      <a:fillRect/>
+                    </a:stretch>
+                  </pic:blipFill>
+                  <pic:spPr>
+                    <a:xfrm>
+                      <a:off x="0" y="0"/>
+                      <a:ext cx="5943600" cy="3714750"/>
+                    </a:xfrm>
+                    <a:prstGeom prst="rect"/>
+                  </pic:spPr>
+                </pic:pic>
+              </a:graphicData>
+            </a:graphic>
+          </wp:inline>
+        </w:drawing>
+      </w:r>
+    </w:p>
+    <w:p>
+      <w:pPr>
+        <w:keepNext w:val="0"/>
+        <w:keepLines/>
+        <w:spacing w:before="0" w:after="200" w:line="259" w:lineRule="auto"/>
+      </w:pPr>
+      <w:r>
+        <w:rPr>
+          <w:rFonts w:ascii="Helvetica Neue" w:hAnsi="Helvetica Neue"/>
+          <w:b w:val="0"/>
+          <w:color w:val="000000"/>
+          <w:sz w:val="22"/>
+        </w:rPr>
+        <w:t>One viewport, five workflow stages. Settings scroll on the left; inspectors scroll on the right. Texture shows the building’s actual embedded albedo. Drag a divider to resize either panel.</w:t>
+      </w:r>
+    </w:p>
+    <w:p>
+      <w:pPr>
+        <w:keepNext/>
+        <w:keepLines/>
+        <w:spacing w:before="0" w:after="100" w:line="240" w:lineRule="auto"/>
+      </w:pPr>
+      <w:r>
+        <w:rPr>
+          <w:rFonts w:ascii="Helvetica Neue" w:hAnsi="Helvetica Neue"/>
+          <w:b w:val="0"/>
+          <w:color w:val="000000"/>
+          <w:sz w:val="22"/>
+        </w:rPr>
+      </w:r>
+      <w:r>
+        <w:drawing>
+          <wp:inline>
+            <wp:extent cx="2880360" cy="1529991"/>
+            <wp:docPr id="3" name="Picture 3" descr="example tank — actual ModelUnify v1.11.4 screenshot"/>
+            <wp:cNvGraphicFramePr>
+              <a:graphicFrameLocks noChangeAspect="1"/>
+            </wp:cNvGraphicFramePr>
+            <a:graphic>
+              <a:graphicData uri="http://schemas.openxmlformats.org/drawingml/2006/picture">
+                <pic:pic>
+                  <pic:nvPicPr>
+                    <pic:cNvPr id="0" name="image.png"/>
+                    <pic:cNvPicPr/>
+                  </pic:nvPicPr>
+                  <pic:blipFill>
+                    <a:blip r:embed="rId11"/>
+                    <a:stretch>
+                      <a:fillRect/>
+                    </a:stretch>
+                  </pic:blipFill>
+                  <pic:spPr>
+                    <a:xfrm>
+                      <a:off x="0" y="0"/>
+                      <a:ext cx="2880360" cy="1529991"/>
+                    </a:xfrm>
+                    <a:prstGeom prst="rect"/>
+                  </pic:spPr>
+                </pic:pic>
+              </a:graphicData>
+            </a:graphic>
+          </wp:inline>
+        </w:drawing>
+      </w:r>
+      <w:r>
+        <w:t xml:space="preserve">  </w:t>
+      </w:r>
+      <w:r>
+        <w:drawing>
+          <wp:inline>
+            <wp:extent cx="2880360" cy="1529991"/>
+            <wp:docPr id="4" name="Picture 4" descr="example jet — actual ModelUnify v1.11.4 screenshot"/>
+            <wp:cNvGraphicFramePr>
+              <a:graphicFrameLocks noChangeAspect="1"/>
+            </wp:cNvGraphicFramePr>
+            <a:graphic>
+              <a:graphicData uri="http://schemas.openxmlformats.org/drawingml/2006/picture">
+                <pic:pic>
+                  <pic:nvPicPr>
+                    <pic:cNvPr id="0" name="image.png"/>
+                    <pic:cNvPicPr/>
+                  </pic:nvPicPr>
+                  <pic:blipFill>
+                    <a:blip r:embed="rId12"/>
+                    <a:stretch>
+                      <a:fillRect/>
+                    </a:stretch>
+                  </pic:blipFill>
+                  <pic:spPr>
+                    <a:xfrm>
+                      <a:off x="0" y="0"/>
+                      <a:ext cx="2880360" cy="1529991"/>
+                    </a:xfrm>
+                    <a:prstGeom prst="rect"/>
+                  </pic:spPr>
+                </pic:pic>
+              </a:graphicData>
+            </a:graphic>
+          </wp:inline>
+        </w:drawing>
+      </w:r>
+    </w:p>
+    <w:p>
+      <w:pPr>
+        <w:keepNext w:val="0"/>
+        <w:keepLines/>
+        <w:spacing w:before="0" w:after="120" w:line="259" w:lineRule="auto"/>
+      </w:pPr>
+      <w:r>
+        <w:rPr>
+          <w:rFonts w:ascii="Helvetica Neue" w:hAnsi="Helvetica Neue"/>
+          <w:b w:val="0"/>
+          <w:color w:val="000000"/>
+          <w:sz w:val="22"/>
+        </w:rPr>
+        <w:t>Saved examples: textured tank (left, 40,000 triangles) and TRELLIS.2 jet shape (right, about 20,000 triangles, no UVs or textures). Inspect thin parts and dimensions before use; these are static meshes, not game-ready vehicles.</w:t>
+      </w:r>
+    </w:p>
+    <w:p>
+      <w:pPr>
+        <w:keepNext/>
+        <w:keepLines/>
+        <w:pageBreakBefore/>
+        <w:spacing w:before="0" w:after="180" w:line="259" w:lineRule="auto"/>
+      </w:pPr>
+      <w:r>
+        <w:rPr>
+          <w:rFonts w:ascii="Helvetica Neue" w:hAnsi="Helvetica Neue"/>
+          <w:b/>
+          <w:color w:val="000000"/>
+          <w:sz w:val="44"/>
+        </w:rPr>
+        <w:t>Inputs and single-view generation</w:t>
+      </w:r>
+    </w:p>
+    <w:p>
+      <w:pPr>
+        <w:keepNext w:val="0"/>
+        <w:keepLines/>
+        <w:spacing w:before="0" w:after="120" w:line="259" w:lineRule="auto"/>
+      </w:pPr>
+      <w:r>
+        <w:rPr>
+          <w:rFonts w:ascii="Helvetica Neue" w:hAnsi="Helvetica Neue"/>
+          <w:b w:val="0"/>
+          <w:color w:val="000000"/>
+          <w:sz w:val="22"/>
+        </w:rPr>
+        <w:t>The hangar is an earlier Hunyuan result. Changing the selected backend leaves that saved preview in place until a new generation job completes.</w:t>
+      </w:r>
+    </w:p>
+    <w:p>
+      <w:pPr>
+        <w:keepNext/>
+        <w:keepLines/>
+        <w:spacing w:before="0" w:after="100" w:line="240" w:lineRule="auto"/>
+      </w:pPr>
+      <w:r>
+        <w:rPr>
+          <w:rFonts w:ascii="Helvetica Neue" w:hAnsi="Helvetica Neue"/>
+          <w:b w:val="0"/>
+          <w:color w:val="000000"/>
+          <w:sz w:val="22"/>
+        </w:rPr>
+      </w:r>
+      <w:r>
+        <w:drawing>
+          <wp:inline>
+            <wp:extent cx="2880360" cy="5082988"/>
+            <wp:docPr id="5" name="Picture 5" descr="inputs hunyuan multiview — actual ModelUnify v1.11.4 screenshot"/>
+            <wp:cNvGraphicFramePr>
+              <a:graphicFrameLocks noChangeAspect="1"/>
+            </wp:cNvGraphicFramePr>
+            <a:graphic>
+              <a:graphicData uri="http://schemas.openxmlformats.org/drawingml/2006/picture">
+                <pic:pic>
+                  <pic:nvPicPr>
+                    <pic:cNvPr id="0" name="image.png"/>
+                    <pic:cNvPicPr/>
+                  </pic:nvPicPr>
+                  <pic:blipFill>
+                    <a:blip r:embed="rId13"/>
+                    <a:stretch>
+                      <a:fillRect/>
+                    </a:stretch>
+                  </pic:blipFill>
+                  <pic:spPr>
+                    <a:xfrm>
+                      <a:off x="0" y="0"/>
+                      <a:ext cx="2880360" cy="5082988"/>
+                    </a:xfrm>
+                    <a:prstGeom prst="rect"/>
+                  </pic:spPr>
+                </pic:pic>
+              </a:graphicData>
+            </a:graphic>
+          </wp:inline>
+        </w:drawing>
+      </w:r>
+      <w:r>
+        <w:t xml:space="preserve">  </w:t>
+      </w:r>
+      <w:r>
+        <w:drawing>
+          <wp:inline>
+            <wp:extent cx="2880360" cy="5082988"/>
+            <wp:docPr id="6" name="Picture 6" descr="generate triposg — actual ModelUnify v1.11.4 screenshot"/>
+            <wp:cNvGraphicFramePr>
+              <a:graphicFrameLocks noChangeAspect="1"/>
+            </wp:cNvGraphicFramePr>
+            <a:graphic>
+              <a:graphicData uri="http://schemas.openxmlformats.org/drawingml/2006/picture">
+                <pic:pic>
+                  <pic:nvPicPr>
+                    <pic:cNvPr id="0" name="image.png"/>
+                    <pic:cNvPicPr/>
+                  </pic:nvPicPr>
+                  <pic:blipFill>
+                    <a:blip r:embed="rId14"/>
+                    <a:stretch>
+                      <a:fillRect/>
+                    </a:stretch>
+                  </pic:blipFill>
+                  <pic:spPr>
+                    <a:xfrm>
+                      <a:off x="0" y="0"/>
+                      <a:ext cx="2880360" cy="5082988"/>
+                    </a:xfrm>
+                    <a:prstGeom prst="rect"/>
+                  </pic:spPr>
+                </pic:pic>
+              </a:graphicData>
+            </a:graphic>
+          </wp:inline>
+        </w:drawing>
+      </w:r>
+    </w:p>
+    <w:p>
+      <w:pPr>
+        <w:keepNext w:val="0"/>
+        <w:keepLines/>
+        <w:spacing w:before="0" w:after="120" w:line="259" w:lineRule="auto"/>
+      </w:pPr>
+      <w:r>
+        <w:rPr>
+          <w:rFonts w:ascii="Helvetica Neue" w:hAnsi="Helvetica Neue"/>
+          <w:b w:val="0"/>
+          <w:color w:val="000000"/>
+          <w:sz w:val="21"/>
+        </w:rPr>
+        <w:t>Left — Hunyuan3D-2mv: Front, Left, Back and Right show the saved reference set. Scroll to background removal, cropping and mask correction. This untextured shape still needs openings and topology review.</w:t>
+      </w:r>
+    </w:p>
+    <w:p>
+      <w:pPr>
+        <w:keepNext w:val="0"/>
+        <w:keepLines/>
+        <w:spacing w:before="0" w:after="120" w:line="259" w:lineRule="auto"/>
+      </w:pPr>
+      <w:r>
+        <w:rPr>
+          <w:rFonts w:ascii="Helvetica Neue" w:hAnsi="Helvetica Neue"/>
+          <w:b w:val="0"/>
+          <w:color w:val="000000"/>
+          <w:sz w:val="21"/>
+        </w:rPr>
+        <w:t>Right — TripoSG: only one input is shown. Hidden directions are not fused. Check the model information, choose settings and queue Generate mesh to create a new candidate.</w:t>
+      </w:r>
+    </w:p>
+    <w:p>
+      <w:pPr>
+        <w:keepNext w:val="0"/>
+        <w:keepLines/>
+        <w:spacing w:before="0" w:after="120" w:line="259" w:lineRule="auto"/>
+      </w:pPr>
+      <w:r>
+        <w:rPr>
+          <w:rFonts w:ascii="Helvetica Neue" w:hAnsi="Helvetica Neue"/>
+          <w:b w:val="0"/>
+          <w:color w:val="000000"/>
+          <w:sz w:val="21"/>
+        </w:rPr>
+        <w:t>Panel crops from the actual app. Scroll inside each panel to reach the remaining controls; full-window images are available in the Markdown operating guide.</w:t>
+      </w:r>
+    </w:p>
+    <w:p>
+      <w:pPr>
+        <w:keepNext/>
+        <w:keepLines/>
+        <w:pageBreakBefore/>
+        <w:spacing w:before="0" w:after="180" w:line="259" w:lineRule="auto"/>
+      </w:pPr>
+      <w:r>
+        <w:rPr>
+          <w:rFonts w:ascii="Helvetica Neue" w:hAnsi="Helvetica Neue"/>
+          <w:b/>
+          <w:color w:val="000000"/>
+          <w:sz w:val="44"/>
+        </w:rPr>
+        <w:t>Advanced generation settings</w:t>
+      </w:r>
+    </w:p>
+    <w:p>
+      <w:pPr>
+        <w:keepNext w:val="0"/>
+        <w:keepLines/>
+        <w:spacing w:before="0" w:after="120" w:line="259" w:lineRule="auto"/>
+      </w:pPr>
+      <w:r>
+        <w:rPr>
+          <w:rFonts w:ascii="Helvetica Neue" w:hAnsi="Helvetica Neue"/>
+          <w:b w:val="0"/>
+          <w:color w:val="000000"/>
+          <w:sz w:val="22"/>
+        </w:rPr>
+        <w:t>Scroll inside the settings panel for these controls. Higher values increase work and memory use; they do not establish geometric accuracy.</w:t>
+      </w:r>
+    </w:p>
+    <w:p>
+      <w:pPr>
+        <w:keepNext/>
+        <w:keepLines/>
+        <w:spacing w:before="0" w:after="100" w:line="240" w:lineRule="auto"/>
+      </w:pPr>
+      <w:r>
+        <w:rPr>
+          <w:rFonts w:ascii="Helvetica Neue" w:hAnsi="Helvetica Neue"/>
+          <w:b w:val="0"/>
+          <w:color w:val="000000"/>
+          <w:sz w:val="22"/>
+        </w:rPr>
+      </w:r>
+      <w:r>
+        <w:drawing>
+          <wp:inline>
+            <wp:extent cx="2880360" cy="5082988"/>
+            <wp:docPr id="7" name="Picture 7" descr="generate hunyuan — actual ModelUnify v1.11.4 screenshot"/>
+            <wp:cNvGraphicFramePr>
+              <a:graphicFrameLocks noChangeAspect="1"/>
+            </wp:cNvGraphicFramePr>
+            <a:graphic>
+              <a:graphicData uri="http://schemas.openxmlformats.org/drawingml/2006/picture">
+                <pic:pic>
+                  <pic:nvPicPr>
+                    <pic:cNvPr id="0" name="image.png"/>
+                    <pic:cNvPicPr/>
+                  </pic:nvPicPr>
+                  <pic:blipFill>
+                    <a:blip r:embed="rId15"/>
+                    <a:stretch>
+                      <a:fillRect/>
+                    </a:stretch>
+                  </pic:blipFill>
+                  <pic:spPr>
+                    <a:xfrm>
+                      <a:off x="0" y="0"/>
+                      <a:ext cx="2880360" cy="5082988"/>
+                    </a:xfrm>
+                    <a:prstGeom prst="rect"/>
+                  </pic:spPr>
+                </pic:pic>
+              </a:graphicData>
+            </a:graphic>
+          </wp:inline>
+        </w:drawing>
+      </w:r>
+      <w:r>
+        <w:t xml:space="preserve">  </w:t>
+      </w:r>
+      <w:r>
+        <w:drawing>
+          <wp:inline>
+            <wp:extent cx="2880360" cy="5082988"/>
+            <wp:docPr id="8" name="Picture 8" descr="generate comfyui — actual ModelUnify v1.11.4 screenshot"/>
+            <wp:cNvGraphicFramePr>
+              <a:graphicFrameLocks noChangeAspect="1"/>
+            </wp:cNvGraphicFramePr>
+            <a:graphic>
+              <a:graphicData uri="http://schemas.openxmlformats.org/drawingml/2006/picture">
+                <pic:pic>
+                  <pic:nvPicPr>
+                    <pic:cNvPr id="0" name="image.png"/>
+                    <pic:cNvPicPr/>
+                  </pic:nvPicPr>
+                  <pic:blipFill>
+                    <a:blip r:embed="rId16"/>
+                    <a:stretch>
+                      <a:fillRect/>
+                    </a:stretch>
+                  </pic:blipFill>
+                  <pic:spPr>
+                    <a:xfrm>
+                      <a:off x="0" y="0"/>
+                      <a:ext cx="2880360" cy="5082988"/>
+                    </a:xfrm>
+                    <a:prstGeom prst="rect"/>
+                  </pic:spPr>
+                </pic:pic>
+              </a:graphicData>
+            </a:graphic>
+          </wp:inline>
+        </w:drawing>
+      </w:r>
+    </w:p>
+    <w:p>
+      <w:pPr>
+        <w:keepNext w:val="0"/>
+        <w:keepLines/>
+        <w:spacing w:before="0" w:after="120" w:line="259" w:lineRule="auto"/>
+      </w:pPr>
+      <w:r>
+        <w:rPr>
+          <w:rFonts w:ascii="Helvetica Neue" w:hAnsi="Helvetica Neue"/>
+          <w:b w:val="0"/>
+          <w:color w:val="000000"/>
+          <w:sz w:val="21"/>
+        </w:rPr>
+        <w:t>Left — Hunyuan: diffusion steps, extraction resolution, guidance, decoder chunks and marching-cubes level. Resolution is distinct from TripoSG’s octree depth. Preserve and compare the raw result.</w:t>
+      </w:r>
+    </w:p>
+    <w:p>
+      <w:pPr>
+        <w:keepNext w:val="0"/>
+        <w:keepLines/>
+        <w:spacing w:before="0" w:after="120" w:line="259" w:lineRule="auto"/>
+      </w:pPr>
+      <w:r>
+        <w:rPr>
+          <w:rFonts w:ascii="Helvetica Neue" w:hAnsi="Helvetica Neue"/>
+          <w:b w:val="0"/>
+          <w:color w:val="000000"/>
+          <w:sz w:val="21"/>
+        </w:rPr>
+        <w:t>Right — Pixal3D: fixed-orbit multiview requires separate weights and matched views at 90-degree intervals. Shape resolution, working-mesh cleanup and PBR atlas are independent. Restore weights and check the isolated Comfy host before generating.</w:t>
+      </w:r>
+    </w:p>
+    <w:p>
+      <w:pPr>
+        <w:keepNext w:val="0"/>
+        <w:keepLines/>
+        <w:spacing w:before="0" w:after="120" w:line="259" w:lineRule="auto"/>
+      </w:pPr>
+      <w:r>
+        <w:rPr>
+          <w:rFonts w:ascii="Helvetica Neue" w:hAnsi="Helvetica Neue"/>
+          <w:b w:val="0"/>
+          <w:color w:val="000000"/>
+          <w:sz w:val="21"/>
+        </w:rPr>
+        <w:t>Panel crops from the actual app. Scroll inside each panel to reach the remaining controls; full-window images are available in the Markdown operating guide.</w:t>
+      </w:r>
+    </w:p>
+    <w:p>
+      <w:pPr>
+        <w:keepNext/>
+        <w:keepLines/>
+        <w:pageBreakBefore/>
+        <w:spacing w:before="0" w:after="180" w:line="259" w:lineRule="auto"/>
+      </w:pPr>
+      <w:r>
+        <w:rPr>
+          <w:rFonts w:ascii="Helvetica Neue" w:hAnsi="Helvetica Neue"/>
+          <w:b/>
+          <w:color w:val="000000"/>
+          <w:sz w:val="44"/>
+        </w:rPr>
+        <w:t>Optimization and texture inspection</w:t>
+      </w:r>
+    </w:p>
+    <w:p>
+      <w:pPr>
+        <w:keepNext w:val="0"/>
+        <w:keepLines/>
+        <w:spacing w:before="0" w:after="120" w:line="259" w:lineRule="auto"/>
+      </w:pPr>
+      <w:r>
+        <w:rPr>
+          <w:rFonts w:ascii="Helvetica Neue" w:hAnsi="Helvetica Neue"/>
+          <w:b w:val="0"/>
+          <w:color w:val="000000"/>
+          <w:sz w:val="22"/>
+        </w:rPr>
+        <w:t>Inspect the currently displayed GLB before making another working copy. Existing materials and geometry remain the reference for review.</w:t>
+      </w:r>
+    </w:p>
+    <w:p>
+      <w:pPr>
+        <w:keepNext/>
+        <w:keepLines/>
+        <w:spacing w:before="0" w:after="100" w:line="240" w:lineRule="auto"/>
+      </w:pPr>
+      <w:r>
+        <w:rPr>
+          <w:rFonts w:ascii="Helvetica Neue" w:hAnsi="Helvetica Neue"/>
+          <w:b w:val="0"/>
+          <w:color w:val="000000"/>
+          <w:sz w:val="22"/>
+        </w:rPr>
+      </w:r>
+      <w:r>
+        <w:drawing>
+          <wp:inline>
+            <wp:extent cx="2880360" cy="5082988"/>
+            <wp:docPr id="9" name="Picture 9" descr="optimize — actual ModelUnify v1.11.4 screenshot"/>
+            <wp:cNvGraphicFramePr>
+              <a:graphicFrameLocks noChangeAspect="1"/>
+            </wp:cNvGraphicFramePr>
+            <a:graphic>
+              <a:graphicData uri="http://schemas.openxmlformats.org/drawingml/2006/picture">
+                <pic:pic>
+                  <pic:nvPicPr>
+                    <pic:cNvPr id="0" name="image.png"/>
+                    <pic:cNvPicPr/>
+                  </pic:nvPicPr>
+                  <pic:blipFill>
+                    <a:blip r:embed="rId17"/>
+                    <a:stretch>
+                      <a:fillRect/>
+                    </a:stretch>
+                  </pic:blipFill>
+                  <pic:spPr>
+                    <a:xfrm>
+                      <a:off x="0" y="0"/>
+                      <a:ext cx="2880360" cy="5082988"/>
+                    </a:xfrm>
+                    <a:prstGeom prst="rect"/>
+                  </pic:spPr>
+                </pic:pic>
+              </a:graphicData>
+            </a:graphic>
+          </wp:inline>
+        </w:drawing>
+      </w:r>
+      <w:r>
+        <w:t xml:space="preserve">  </w:t>
+      </w:r>
+      <w:r>
+        <w:drawing>
+          <wp:inline>
+            <wp:extent cx="2880360" cy="5080247"/>
+            <wp:docPr id="10" name="Picture 10" descr="texture inspector — actual ModelUnify v1.11.4 screenshot"/>
+            <wp:cNvGraphicFramePr>
+              <a:graphicFrameLocks noChangeAspect="1"/>
+            </wp:cNvGraphicFramePr>
+            <a:graphic>
+              <a:graphicData uri="http://schemas.openxmlformats.org/drawingml/2006/picture">
+                <pic:pic>
+                  <pic:nvPicPr>
+                    <pic:cNvPr id="0" name="image.png"/>
+                    <pic:cNvPicPr/>
+                  </pic:nvPicPr>
+                  <pic:blipFill>
+                    <a:blip r:embed="rId18"/>
+                    <a:stretch>
+                      <a:fillRect/>
+                    </a:stretch>
+                  </pic:blipFill>
+                  <pic:spPr>
+                    <a:xfrm>
+                      <a:off x="0" y="0"/>
+                      <a:ext cx="2880360" cy="5080247"/>
+                    </a:xfrm>
+                    <a:prstGeom prst="rect"/>
+                  </pic:spPr>
+                </pic:pic>
+              </a:graphicData>
+            </a:graphic>
+          </wp:inline>
+        </w:drawing>
+      </w:r>
+    </w:p>
+    <w:p>
+      <w:pPr>
+        <w:keepNext w:val="0"/>
+        <w:keepLines/>
+        <w:spacing w:before="0" w:after="120" w:line="259" w:lineRule="auto"/>
+      </w:pPr>
+      <w:r>
+        <w:rPr>
+          <w:rFonts w:ascii="Helvetica Neue" w:hAnsi="Helvetica Neue"/>
+          <w:b w:val="0"/>
+          <w:color w:val="000000"/>
+          <w:sz w:val="21"/>
+        </w:rPr>
+        <w:t>Left — Optimize: the 8,000-triangle field is a target, not the current count. Review safeguards, achieved counts and thin parts before accepting a result.</w:t>
+      </w:r>
+    </w:p>
+    <w:p>
+      <w:pPr>
+        <w:keepNext w:val="0"/>
+        <w:keepLines/>
+        <w:spacing w:before="0" w:after="120" w:line="259" w:lineRule="auto"/>
+      </w:pPr>
+      <w:r>
+        <w:rPr>
+          <w:rFonts w:ascii="Helvetica Neue" w:hAnsi="Helvetica Neue"/>
+          <w:b w:val="0"/>
+          <w:color w:val="000000"/>
+          <w:sz w:val="21"/>
+        </w:rPr>
+        <w:t>Right — Texture inspector: the right panel shows pixels already embedded in the building. Inspect material above the viewport isolates available channels. Painting controls are in the Texture stage.</w:t>
+      </w:r>
+    </w:p>
+    <w:p>
+      <w:pPr>
+        <w:keepNext w:val="0"/>
+        <w:keepLines/>
+        <w:spacing w:before="0" w:after="120" w:line="259" w:lineRule="auto"/>
+      </w:pPr>
+      <w:r>
+        <w:rPr>
+          <w:rFonts w:ascii="Helvetica Neue" w:hAnsi="Helvetica Neue"/>
+          <w:b w:val="0"/>
+          <w:color w:val="000000"/>
+          <w:sz w:val="21"/>
+        </w:rPr>
+        <w:t>Panel crops from the actual app. Scroll inside each panel to reach the remaining controls; full-window images are available in the Markdown operating guide.</w:t>
+      </w:r>
+    </w:p>
+    <w:p>
+      <w:pPr>
+        <w:keepNext/>
+        <w:keepLines/>
+        <w:pageBreakBefore/>
+        <w:spacing w:before="0" w:after="180" w:line="259" w:lineRule="auto"/>
+      </w:pPr>
+      <w:r>
+        <w:rPr>
+          <w:rFonts w:ascii="Helvetica Neue" w:hAnsi="Helvetica Neue"/>
+          <w:b/>
+          <w:color w:val="000000"/>
+          <w:sz w:val="44"/>
+        </w:rPr>
+        <w:t>LOD export and static BMS handoff</w:t>
+      </w:r>
+    </w:p>
+    <w:p>
+      <w:pPr>
+        <w:keepNext w:val="0"/>
+        <w:keepLines/>
+        <w:spacing w:before="0" w:after="120" w:line="259" w:lineRule="auto"/>
+      </w:pPr>
+      <w:r>
+        <w:rPr>
+          <w:rFonts w:ascii="Helvetica Neue" w:hAnsi="Helvetica Neue"/>
+          <w:b w:val="0"/>
+          <w:color w:val="000000"/>
+          <w:sz w:val="22"/>
+        </w:rPr>
+        <w:t>These screens show export configuration. Inspect actual output LODs and keep reports with the package; no export or deployment was run for these pictures.</w:t>
+      </w:r>
+    </w:p>
+    <w:p>
+      <w:pPr>
+        <w:keepNext/>
+        <w:keepLines/>
+        <w:spacing w:before="0" w:after="100" w:line="240" w:lineRule="auto"/>
+      </w:pPr>
+      <w:r>
+        <w:rPr>
+          <w:rFonts w:ascii="Helvetica Neue" w:hAnsi="Helvetica Neue"/>
+          <w:b w:val="0"/>
+          <w:color w:val="000000"/>
+          <w:sz w:val="22"/>
+        </w:rPr>
+      </w:r>
+      <w:r>
+        <w:drawing>
+          <wp:inline>
+            <wp:extent cx="2880360" cy="5082988"/>
+            <wp:docPr id="11" name="Picture 11" descr="export lods — actual ModelUnify v1.11.4 screenshot"/>
+            <wp:cNvGraphicFramePr>
+              <a:graphicFrameLocks noChangeAspect="1"/>
+            </wp:cNvGraphicFramePr>
+            <a:graphic>
+              <a:graphicData uri="http://schemas.openxmlformats.org/drawingml/2006/picture">
+                <pic:pic>
+                  <pic:nvPicPr>
+                    <pic:cNvPr id="0" name="image.png"/>
+                    <pic:cNvPicPr/>
+                  </pic:nvPicPr>
+                  <pic:blipFill>
+                    <a:blip r:embed="rId19"/>
+                    <a:stretch>
+                      <a:fillRect/>
+                    </a:stretch>
+                  </pic:blipFill>
+                  <pic:spPr>
+                    <a:xfrm>
+                      <a:off x="0" y="0"/>
+                      <a:ext cx="2880360" cy="5082988"/>
+                    </a:xfrm>
+                    <a:prstGeom prst="rect"/>
+                  </pic:spPr>
+                </pic:pic>
+              </a:graphicData>
+            </a:graphic>
+          </wp:inline>
+        </w:drawing>
+      </w:r>
+      <w:r>
+        <w:t xml:space="preserve">  </w:t>
+      </w:r>
+      <w:r>
+        <w:drawing>
+          <wp:inline>
+            <wp:extent cx="2880360" cy="5082988"/>
+            <wp:docPr id="12" name="Picture 12" descr="export bms — actual ModelUnify v1.11.4 screenshot"/>
+            <wp:cNvGraphicFramePr>
+              <a:graphicFrameLocks noChangeAspect="1"/>
+            </wp:cNvGraphicFramePr>
+            <a:graphic>
+              <a:graphicData uri="http://schemas.openxmlformats.org/drawingml/2006/picture">
+                <pic:pic>
+                  <pic:nvPicPr>
+                    <pic:cNvPr id="0" name="image.png"/>
+                    <pic:cNvPicPr/>
+                  </pic:nvPicPr>
+                  <pic:blipFill>
+                    <a:blip r:embed="rId20"/>
+                    <a:stretch>
+                      <a:fillRect/>
+                    </a:stretch>
+                  </pic:blipFill>
+                  <pic:spPr>
+                    <a:xfrm>
+                      <a:off x="0" y="0"/>
+                      <a:ext cx="2880360" cy="5082988"/>
+                    </a:xfrm>
+                    <a:prstGeom prst="rect"/>
+                  </pic:spPr>
+                </pic:pic>
+              </a:graphicData>
+            </a:graphic>
+          </wp:inline>
+        </w:drawing>
+      </w:r>
+    </w:p>
+    <w:p>
+      <w:pPr>
+        <w:keepNext w:val="0"/>
+        <w:keepLines/>
+        <w:spacing w:before="0" w:after="120" w:line="259" w:lineRule="auto"/>
+      </w:pPr>
+      <w:r>
+        <w:rPr>
+          <w:rFonts w:ascii="Helvetica Neue" w:hAnsi="Helvetica Neue"/>
+          <w:b w:val="0"/>
+          <w:color w:val="000000"/>
+          <w:sz w:val="21"/>
+        </w:rPr>
+        <w:t>Left — Export: choose 1 to 7 decreasing LOD budgets and shared textures where UVs are valid. Scroll for planning distances and measured scale. Download the complete package so relative material paths stay together.</w:t>
+      </w:r>
+    </w:p>
+    <w:p>
+      <w:pPr>
+        <w:keepNext w:val="0"/>
+        <w:keepLines/>
+        <w:spacing w:before="0" w:after="120" w:line="259" w:lineRule="auto"/>
+      </w:pPr>
+      <w:r>
+        <w:rPr>
+          <w:rFonts w:ascii="Helvetica Neue" w:hAnsi="Helvetica Neue"/>
+          <w:b w:val="0"/>
+          <w:color w:val="000000"/>
+          <w:sz w:val="21"/>
+        </w:rPr>
+        <w:t>Right — General interchange / BMS handoff: optional static sidecars include material, MTI and Parent.dat data. Verify signed axes and physical scale. BML/DDS conversion, slot reconciliation, registration and in-game checks remain external.</w:t>
+      </w:r>
+    </w:p>
+    <w:p>
+      <w:pPr>
+        <w:keepNext w:val="0"/>
+        <w:keepLines/>
+        <w:spacing w:before="0" w:after="120" w:line="259" w:lineRule="auto"/>
+      </w:pPr>
+      <w:r>
+        <w:rPr>
+          <w:rFonts w:ascii="Helvetica Neue" w:hAnsi="Helvetica Neue"/>
+          <w:b w:val="0"/>
+          <w:color w:val="000000"/>
+          <w:sz w:val="21"/>
+        </w:rPr>
+        <w:t>Panel crops from the actual app. Scroll inside each panel to reach the remaining controls; full-window images are available in the Markdown operating guide.</w:t>
+      </w:r>
+    </w:p>
     <w:sectPr>
       <w:headerReference r:id="rId9" w:type="default"/>
       <w:footerReference r:id="rId10" w:type="default"/>
@@ -3207,7 +4075,7 @@
                   <w:szCs w:val="17"/>
                   <w:rtl w:val="0"/>
                 </w:rPr>
-                <w:t xml:space="preserve">28 October 2026</w:t>
+                <w:t xml:space="preserve">30 October 2026</w:t>
               </w:r>
             </w:p>
           </w:tc>

</xml_diff>

<commit_message>
Add tracked model management and source release packaging (v1.12.1)
</commit_message>
<xml_diff>
--- a/docs/ModelUnify_Operating_Guide.docx
+++ b/docs/ModelUnify_Operating_Guide.docx
@@ -953,7 +953,7 @@
         <w:rPr>
           <w:rtl w:val="0"/>
         </w:rPr>
-        <w:t xml:space="preserve">Version 1.11.4 keeps AI weights optional. After installing the main environment, existing meshes support inspection, manual masks, CPU optimization, UV rebaking and export. Generation, paint and learned preparation need their model downloads. Fresh installations also need the native extensions before painting.</w:t>
+        <w:t xml:space="preserve">Version 1.12.1 keeps AI weights optional and manages installation in Models. After environment setup, existing meshes support inspection, manual masks, CPU optimization, UV rebaking and export. AI workflows need verified checkpoints and runtimes. Fresh installations must follow docs/INSTALLATION.md.</w:t>
       </w:r>
     </w:p>
     <w:bookmarkStart w:colFirst="0" w:colLast="0" w:name="bookmark=id.1sqjewf8afxt" w:id="2"/>
@@ -1143,7 +1143,7 @@
         <w:rPr>
           <w:rtl w:val="0"/>
         </w:rPr>
-        <w:t xml:space="preserve">Fresh clones need CPython 3.11 x64 and the environment setup in docs/INSTALLATION.md. Restore selected model weights separately. On a new machine, build native paint extensions with compatible MSVC/CUDA tools; Git excludes machine-specific binaries.</w:t>
+        <w:t xml:space="preserve">Fresh clones need CPython 3.11 x64 and environment setup from docs/INSTALLATION.md. Open Models to install selected weights. Native paint builds need compatible MSVC/CUDA tools on a new machine; Git excludes these machine-specific binaries.</w:t>
       </w:r>
     </w:p>
     <w:bookmarkStart w:colFirst="0" w:colLast="0" w:name="bookmark=id.xx7bxdemqiq" w:id="4"/>
@@ -1303,18 +1303,18 @@
         <w:rPr>
           <w:rtl w:val="0"/>
         </w:rPr>
-        <w:t xml:space="preserve">Background options are Keep alpha, RMBG-1.4 and rembg. Keep alpha and manual correction can work without a learned remover. rembg exposes u2net, u2netp, isnet-general-use and silueta; each may need its own download. Select an installed ONNX provider. This workstation has CPU ONNX Runtime; selecting CUDA does not install its GPU provider.</w:t>
-      </w:r>
-    </w:p>
-    <w:p>
-      <w:pPr>
-        <w:rPr/>
-      </w:pPr>
-      <w:r>
-        <w:rPr>
-          <w:rtl w:val="0"/>
-        </w:rPr>
-        <w:t xml:space="preserve">Normal options are Off, Low geometry normals, Medium StableNormal and High Marigold. Low uses CPU geometry and no model download. Medium and High infer detail from an image, may download code or weights, and do not prove physically correct surface detail. Read the report for the actual baker or fallback.</w:t>
+        <w:t xml:space="preserve">Background options are Keep alpha, RMBG-1.4 and rembg. Keep alpha and manual correction need no learned remover. rembg exposes u2net, u2netp, isnet-general-use and silueta; install the selected model through Models. Select an installed ONNX provider; choosing CUDA does not install its GPU runtime.</w:t>
+      </w:r>
+    </w:p>
+    <w:p>
+      <w:pPr>
+        <w:rPr/>
+      </w:pPr>
+      <w:r>
+        <w:rPr>
+          <w:rtl w:val="0"/>
+        </w:rPr>
+        <w:t xml:space="preserve">Normal options are Off, Low geometry normals, Medium StableNormal and High Marigold. Low uses CPU geometry without AI weights. Install Medium or High models through Models first. Their image-derived detail is not proof of physical accuracy. Reports identify the actual baker or fallback.</w:t>
       </w:r>
     </w:p>
     <w:p>
@@ -1419,7 +1419,7 @@
         <w:rPr>
           <w:rtl w:val="0"/>
         </w:rPr>
-        <w:t xml:space="preserve">Generation and material stages have different dependencies. Native TripoSG and Hunyuan paths may download weights on first use; ComfyUI requires explicit setup/download and its Check model action verifies the selected graph. For predictable offline work, restore weights before the session and disable network access only after readiness succeeds.</w:t>
+        <w:t xml:space="preserve">Generation and material stages have different dependencies. Open Models to install and verify selected checkpoints and runtimes before inference. No generation action downloads missing models. For ComfyUI, verify the isolated runtime, start the host and check its selected graph. Check readiness before an offline session.</w:t>
       </w:r>
     </w:p>
     <w:p>
@@ -2642,18 +2642,18 @@
         <w:rPr>
           <w:rtl w:val="0"/>
         </w:rPr>
-        <w:t xml:space="preserve">With ComfyUI installed, run .venv/Scripts/python.exe -m scripts.comfyui_host download --model trellis. Alternatives are pixal, pixal-mv and all. For a fresh runtime use setup instead. Check model afterward.</w:t>
-      </w:r>
-    </w:p>
-    <w:p>
-      <w:pPr>
-        <w:rPr/>
-      </w:pPr>
-      <w:r>
-        <w:rPr>
-          <w:rtl w:val="0"/>
-        </w:rPr>
-        <w:t xml:space="preserve">Native backends load TripoSG/RMBG from pretrained_weights. Hunyuan and DINO use the shared Hugging Face cache. Painting additionally requires the RealESRGAN checkpoint. See docs/MODEL_WEIGHTS.md for download commands and sizes. Selecting a model does not install it.</w:t>
+        <w:t xml:space="preserve">Use Install workflow models for the selected stage, or choose individual models in the library. Shared checkpoints are reused. ComfyUI runtime installation and verification are separate tracked actions; they never install into the main Python environment.</w:t>
+      </w:r>
+    </w:p>
+    <w:p>
+      <w:pPr>
+        <w:rPr/>
+      </w:pPr>
+      <w:r>
+        <w:rPr>
+          <w:rtl w:val="0"/>
+        </w:rPr>
+        <w:t xml:space="preserve">New weights default to pretrained_weights/managed. Change Storage and credentials for future jobs, or register an existing repository folder after read-only source-hash verification. Existing installations and resumed jobs keep their recorded paths. See docs/MODEL_WEIGHTS.md for details.</w:t>
       </w:r>
     </w:p>
     <w:p>
@@ -2721,7 +2721,7 @@
           <w:vertAlign w:val="baseline"/>
           <w:rtl w:val="0"/>
         </w:rPr>
-        <w:t xml:space="preserve">Missing checkpoint: restore the selected model, then check readiness. CUDA memory failure: review offload and draft settings; do not replace the CUDA stack silently.</w:t>
+        <w:t xml:space="preserve">Missing checkpoint: open Models and install or verify the selected model. Runtime checks can still block downloaded weights. CUDA memory failure: review offload and draft settings; do not replace the CUDA stack silently.</w:t>
       </w:r>
     </w:p>
     <w:p>
@@ -3810,6 +3810,281 @@
           <w:sz w:val="21"/>
         </w:rPr>
         <w:t>Panel crops from the actual app. Scroll inside each panel to reach the remaining controls; full-window images are available in the Markdown operating guide.</w:t>
+      </w:r>
+    </w:p>
+    <w:p>
+      <w:pPr>
+        <w:keepNext/>
+        <w:keepLines/>
+        <w:pageBreakBefore/>
+        <w:spacing w:before="0" w:after="200" w:line="259" w:lineRule="auto"/>
+      </w:pPr>
+      <w:r>
+        <w:rPr>
+          <w:rFonts w:ascii="Helvetica Neue" w:hAnsi="Helvetica Neue"/>
+          <w:b/>
+          <w:color w:val="000000"/>
+          <w:sz w:val="44"/>
+        </w:rPr>
+        <w:t>Models and downloads</w:t>
+      </w:r>
+    </w:p>
+    <w:p>
+      <w:pPr>
+        <w:keepNext w:val="0"/>
+        <w:keepLines/>
+        <w:spacing w:before="0" w:after="140" w:line="259" w:lineRule="auto"/>
+      </w:pPr>
+      <w:r>
+        <w:rPr>
+          <w:rFonts w:ascii="Helvetica Neue" w:hAnsi="Helvetica Neue"/>
+          <w:b w:val="0"/>
+          <w:color w:val="000000"/>
+          <w:sz w:val="22"/>
+        </w:rPr>
+        <w:t>Install and manage AI components inside the same app window. This v1.12.0 screenshot shows the actual production model catalog; no AI weights were installed for the screenshot.</w:t>
+      </w:r>
+    </w:p>
+    <w:p>
+      <w:pPr>
+        <w:keepNext/>
+        <w:keepLines/>
+        <w:spacing w:before="0" w:after="140" w:line="240" w:lineRule="auto"/>
+      </w:pPr>
+      <w:r>
+        <w:rPr>
+          <w:rFonts w:ascii="Helvetica Neue" w:hAnsi="Helvetica Neue"/>
+          <w:b w:val="0"/>
+          <w:color w:val="000000"/>
+          <w:sz w:val="22"/>
+        </w:rPr>
+      </w:r>
+      <w:r>
+        <w:drawing>
+          <wp:inline>
+            <wp:extent cx="5943600" cy="3714750"/>
+            <wp:docPr id="13" name="Picture 13" descr="Actual ModelUnify v1.12.0 Models workspace with model library, prerequisites and installation activity"/>
+            <wp:cNvGraphicFramePr>
+              <a:graphicFrameLocks noChangeAspect="1"/>
+            </wp:cNvGraphicFramePr>
+            <a:graphic>
+              <a:graphicData uri="http://schemas.openxmlformats.org/drawingml/2006/picture">
+                <pic:pic>
+                  <pic:nvPicPr>
+                    <pic:cNvPr id="0" name="models-manager.png"/>
+                    <pic:cNvPicPr/>
+                  </pic:nvPicPr>
+                  <pic:blipFill>
+                    <a:blip r:embed="rId21"/>
+                    <a:stretch>
+                      <a:fillRect/>
+                    </a:stretch>
+                  </pic:blipFill>
+                  <pic:spPr>
+                    <a:xfrm>
+                      <a:off x="0" y="0"/>
+                      <a:ext cx="5943600" cy="3714750"/>
+                    </a:xfrm>
+                    <a:prstGeom prst="rect"/>
+                  </pic:spPr>
+                </pic:pic>
+              </a:graphicData>
+            </a:graphic>
+          </wp:inline>
+        </w:drawing>
+      </w:r>
+    </w:p>
+    <w:p>
+      <w:pPr>
+        <w:keepNext w:val="0"/>
+        <w:keepLines/>
+        <w:spacing w:before="0" w:after="140" w:line="259" w:lineRule="auto"/>
+      </w:pPr>
+      <w:r>
+        <w:rPr>
+          <w:rFonts w:ascii="Helvetica Neue" w:hAnsi="Helvetica Neue"/>
+          <w:b w:val="0"/>
+          <w:color w:val="000000"/>
+          <w:sz w:val="21"/>
+        </w:rPr>
+        <w:t>Library on the left, selected model details in the center and installation activity on the right. Scroll within the panels for storage, existing-folder registration, runtime actions and reviewed cleanup. Back to workbench preserves the existing 3D scene and camera.</w:t>
+      </w:r>
+    </w:p>
+    <w:p>
+      <w:pPr>
+        <w:keepNext w:val="0"/>
+        <w:keepLines/>
+        <w:spacing w:before="0" w:after="140" w:line="259" w:lineRule="auto"/>
+      </w:pPr>
+      <w:r>
+        <w:rPr>
+          <w:rFonts w:ascii="Helvetica Neue" w:hAnsi="Helvetica Neue"/>
+          <w:b w:val="0"/>
+          <w:color w:val="000000"/>
+          <w:sz w:val="21"/>
+        </w:rPr>
+        <w:t>Downloaded files and Ready are separate states. Ready means the recorded files and runtime prerequisites passed their checks; it does not certify model quality or prove that inference was tested.</w:t>
+      </w:r>
+    </w:p>
+    <w:p>
+      <w:pPr>
+        <w:keepNext/>
+        <w:keepLines/>
+        <w:pageBreakBefore/>
+        <w:spacing w:before="0" w:after="200" w:line="259" w:lineRule="auto"/>
+      </w:pPr>
+      <w:r>
+        <w:rPr>
+          <w:rFonts w:ascii="Helvetica Neue" w:hAnsi="Helvetica Neue"/>
+          <w:b/>
+          <w:color w:val="000000"/>
+          <w:sz w:val="44"/>
+        </w:rPr>
+        <w:t>Install verify and recover</w:t>
+      </w:r>
+    </w:p>
+    <w:p>
+      <w:pPr>
+        <w:keepNext w:val="0"/>
+        <w:keepLines/>
+        <w:spacing w:before="0" w:after="120" w:line="259" w:lineRule="auto"/>
+      </w:pPr>
+      <w:r>
+        <w:rPr>
+          <w:rFonts w:ascii="Helvetica Neue" w:hAnsi="Helvetica Neue"/>
+          <w:b w:val="0"/>
+          <w:color w:val="000000"/>
+          <w:sz w:val="21"/>
+        </w:rPr>
+        <w:t>Choose storage. Open Models, then Storage and credentials. Select a dedicated folder with enough free space. Estimates are shown before installation; exact file sizes and an immutable revision resolve when the job starts. The manager checks shared dependencies and installation headroom.</w:t>
+      </w:r>
+    </w:p>
+    <w:p>
+      <w:pPr>
+        <w:keepNext w:val="0"/>
+        <w:keepLines/>
+        <w:spacing w:before="0" w:after="120" w:line="259" w:lineRule="auto"/>
+      </w:pPr>
+      <w:r>
+        <w:rPr>
+          <w:rFonts w:ascii="Helvetica Neue" w:hAnsi="Helvetica Neue"/>
+          <w:b w:val="0"/>
+          <w:color w:val="000000"/>
+          <w:sz w:val="21"/>
+        </w:rPr>
+        <w:t>Install selected models. Use Install workflow models for the selected operation, or select a library row and Install / repair. Pixal single-view automatic FOV needs MoGe; Comfy PBR additionally needs the texture VAE. Existing alpha or a manual mask can avoid an unused background-remover download.</w:t>
+      </w:r>
+    </w:p>
+    <w:p>
+      <w:pPr>
+        <w:keepNext w:val="0"/>
+        <w:keepLines/>
+        <w:spacing w:before="0" w:after="120" w:line="259" w:lineRule="auto"/>
+      </w:pPr>
+      <w:r>
+        <w:rPr>
+          <w:rFonts w:ascii="Helvetica Neue" w:hAnsi="Helvetica Neue"/>
+          <w:b w:val="0"/>
+          <w:color w:val="000000"/>
+          <w:sz w:val="21"/>
+        </w:rPr>
+        <w:t>Follow live activity. Resolving, downloading, verifying and installing are distinct stages. Transfers report real bytes, speed and an estimated remaining time when available. Runtime setup reports logs with indeterminate progress. Returning to the workbench does not stop installation.</w:t>
+      </w:r>
+    </w:p>
+    <w:p>
+      <w:pPr>
+        <w:keepNext w:val="0"/>
+        <w:keepLines/>
+        <w:spacing w:before="0" w:after="120" w:line="259" w:lineRule="auto"/>
+      </w:pPr>
+      <w:r>
+        <w:rPr>
+          <w:rFonts w:ascii="Helvetica Neue" w:hAnsi="Helvetica Neue"/>
+          <w:b w:val="0"/>
+          <w:color w:val="000000"/>
+          <w:sz w:val="21"/>
+        </w:rPr>
+        <w:t>Cancel and resume. Cancel installation waits for a read or safe boundary. Retry / resume reuses retained partial files when the source supports byte ranges. A server restart leaves interrupted jobs waiting for Retry. Resumed jobs retain their pinned revision and original destination.</w:t>
+      </w:r>
+    </w:p>
+    <w:p>
+      <w:pPr>
+        <w:keepNext w:val="0"/>
+        <w:keepLines/>
+        <w:spacing w:before="0" w:after="120" w:line="259" w:lineRule="auto"/>
+      </w:pPr>
+      <w:r>
+        <w:rPr>
+          <w:rFonts w:ascii="Helvetica Neue" w:hAnsi="Helvetica Neue"/>
+          <w:b w:val="0"/>
+          <w:color w:val="000000"/>
+          <w:sz w:val="21"/>
+        </w:rPr>
+        <w:t>Verify runtimes. Use Verify ComfyUI runtime in its isolated environment. Paint additionally needs compatible native extensions; Build paint extensions requires installed MSVC/CUDA tools. Use Verify paint runtime afterward. These checks do not load AI checkpoints or run inference.</w:t>
+      </w:r>
+    </w:p>
+    <w:p>
+      <w:pPr>
+        <w:keepNext w:val="0"/>
+        <w:keepLines/>
+        <w:spacing w:before="0" w:after="120" w:line="259" w:lineRule="auto"/>
+      </w:pPr>
+      <w:r>
+        <w:rPr>
+          <w:rFonts w:ascii="Helvetica Neue" w:hAnsi="Helvetica Neue"/>
+          <w:b w:val="0"/>
+          <w:color w:val="000000"/>
+          <w:sz w:val="21"/>
+        </w:rPr>
+        <w:t>Repair and remove. Verify files hashes the recorded installation. Install / repair restores missing or corrupt files; Update model explicitly resolves its upstream recipe. Preview owned-file removal and confirm its exact list. Active components and shared dependencies are protected. External registered files remain read-only.</w:t>
+      </w:r>
+    </w:p>
+    <w:p>
+      <w:pPr>
+        <w:keepNext w:val="0"/>
+        <w:keepLines/>
+        <w:spacing w:before="0" w:after="120" w:line="259" w:lineRule="auto"/>
+      </w:pPr>
+      <w:r>
+        <w:rPr>
+          <w:rFonts w:ascii="Helvetica Neue" w:hAnsi="Helvetica Neue"/>
+          <w:b w:val="0"/>
+          <w:color w:val="000000"/>
+          <w:sz w:val="21"/>
+        </w:rPr>
+        <w:t>Recover space safely. Discard retained download files separately previews partial and completed-but-unpublished files. Published models and unrelated files stay intact. Removed download bytes must be fetched again if that job is retried.</w:t>
+      </w:r>
+    </w:p>
+    <w:p>
+      <w:pPr>
+        <w:keepNext w:val="0"/>
+        <w:keepLines/>
+        <w:spacing w:before="0" w:after="120" w:line="259" w:lineRule="auto"/>
+      </w:pPr>
+      <w:r>
+        <w:rPr>
+          <w:rFonts w:ascii="Helvetica Neue" w:hAnsi="Helvetica Neue"/>
+          <w:b w:val="0"/>
+          <w:color w:val="000000"/>
+          <w:sz w:val="21"/>
+        </w:rPr>
+        <w:t>Keep credentials private. A Hugging Face token can be entered for the server session if the source requires it. It stays in memory and is not stored in configuration, jobs or logs. Follow the linked model terms and access requirements.</w:t>
+      </w:r>
+    </w:p>
+    <w:p>
+      <w:pPr>
+        <w:keepNext w:val="0"/>
+        <w:keepLines/>
+        <w:spacing w:before="0" w:after="100" w:line="259" w:lineRule="auto"/>
+      </w:pPr>
+      <w:r>
+        <w:rPr>
+          <w:rFonts w:ascii="Helvetica Neue" w:hAnsi="Helvetica Neue"/>
+          <w:b w:val="0"/>
+          <w:color w:val="000000"/>
+          <w:sz w:val="21"/>
+        </w:rPr>
+        <w:t>Release tracking. CHANGELOG.md records each version and its main changes. Source exports include a commit manifest, per-file hashes and an archive checksum. They exclude Python runtimes and AI weights; follow INSTALLATION.md after extraction.</w:t>
       </w:r>
     </w:p>
     <w:sectPr>

</xml_diff>

<commit_message>
Add tracked model management and source release packaging (v1.12.1) (#4)
</commit_message>
<xml_diff>
--- a/docs/ModelUnify_Operating_Guide.docx
+++ b/docs/ModelUnify_Operating_Guide.docx
@@ -953,7 +953,7 @@
         <w:rPr>
           <w:rtl w:val="0"/>
         </w:rPr>
-        <w:t xml:space="preserve">Version 1.11.4 keeps AI weights optional. After installing the main environment, existing meshes support inspection, manual masks, CPU optimization, UV rebaking and export. Generation, paint and learned preparation need their model downloads. Fresh installations also need the native extensions before painting.</w:t>
+        <w:t xml:space="preserve">Version 1.12.1 keeps AI weights optional and manages installation in Models. After environment setup, existing meshes support inspection, manual masks, CPU optimization, UV rebaking and export. AI workflows need verified checkpoints and runtimes. Fresh installations must follow docs/INSTALLATION.md.</w:t>
       </w:r>
     </w:p>
     <w:bookmarkStart w:colFirst="0" w:colLast="0" w:name="bookmark=id.1sqjewf8afxt" w:id="2"/>
@@ -1143,7 +1143,7 @@
         <w:rPr>
           <w:rtl w:val="0"/>
         </w:rPr>
-        <w:t xml:space="preserve">Fresh clones need CPython 3.11 x64 and the environment setup in docs/INSTALLATION.md. Restore selected model weights separately. On a new machine, build native paint extensions with compatible MSVC/CUDA tools; Git excludes machine-specific binaries.</w:t>
+        <w:t xml:space="preserve">Fresh clones need CPython 3.11 x64 and environment setup from docs/INSTALLATION.md. Open Models to install selected weights. Native paint builds need compatible MSVC/CUDA tools on a new machine; Git excludes these machine-specific binaries.</w:t>
       </w:r>
     </w:p>
     <w:bookmarkStart w:colFirst="0" w:colLast="0" w:name="bookmark=id.xx7bxdemqiq" w:id="4"/>
@@ -1303,18 +1303,18 @@
         <w:rPr>
           <w:rtl w:val="0"/>
         </w:rPr>
-        <w:t xml:space="preserve">Background options are Keep alpha, RMBG-1.4 and rembg. Keep alpha and manual correction can work without a learned remover. rembg exposes u2net, u2netp, isnet-general-use and silueta; each may need its own download. Select an installed ONNX provider. This workstation has CPU ONNX Runtime; selecting CUDA does not install its GPU provider.</w:t>
-      </w:r>
-    </w:p>
-    <w:p>
-      <w:pPr>
-        <w:rPr/>
-      </w:pPr>
-      <w:r>
-        <w:rPr>
-          <w:rtl w:val="0"/>
-        </w:rPr>
-        <w:t xml:space="preserve">Normal options are Off, Low geometry normals, Medium StableNormal and High Marigold. Low uses CPU geometry and no model download. Medium and High infer detail from an image, may download code or weights, and do not prove physically correct surface detail. Read the report for the actual baker or fallback.</w:t>
+        <w:t xml:space="preserve">Background options are Keep alpha, RMBG-1.4 and rembg. Keep alpha and manual correction need no learned remover. rembg exposes u2net, u2netp, isnet-general-use and silueta; install the selected model through Models. Select an installed ONNX provider; choosing CUDA does not install its GPU runtime.</w:t>
+      </w:r>
+    </w:p>
+    <w:p>
+      <w:pPr>
+        <w:rPr/>
+      </w:pPr>
+      <w:r>
+        <w:rPr>
+          <w:rtl w:val="0"/>
+        </w:rPr>
+        <w:t xml:space="preserve">Normal options are Off, Low geometry normals, Medium StableNormal and High Marigold. Low uses CPU geometry without AI weights. Install Medium or High models through Models first. Their image-derived detail is not proof of physical accuracy. Reports identify the actual baker or fallback.</w:t>
       </w:r>
     </w:p>
     <w:p>
@@ -1419,7 +1419,7 @@
         <w:rPr>
           <w:rtl w:val="0"/>
         </w:rPr>
-        <w:t xml:space="preserve">Generation and material stages have different dependencies. Native TripoSG and Hunyuan paths may download weights on first use; ComfyUI requires explicit setup/download and its Check model action verifies the selected graph. For predictable offline work, restore weights before the session and disable network access only after readiness succeeds.</w:t>
+        <w:t xml:space="preserve">Generation and material stages have different dependencies. Open Models to install and verify selected checkpoints and runtimes before inference. No generation action downloads missing models. For ComfyUI, verify the isolated runtime, start the host and check its selected graph. Check readiness before an offline session.</w:t>
       </w:r>
     </w:p>
     <w:p>
@@ -2642,18 +2642,18 @@
         <w:rPr>
           <w:rtl w:val="0"/>
         </w:rPr>
-        <w:t xml:space="preserve">With ComfyUI installed, run .venv/Scripts/python.exe -m scripts.comfyui_host download --model trellis. Alternatives are pixal, pixal-mv and all. For a fresh runtime use setup instead. Check model afterward.</w:t>
-      </w:r>
-    </w:p>
-    <w:p>
-      <w:pPr>
-        <w:rPr/>
-      </w:pPr>
-      <w:r>
-        <w:rPr>
-          <w:rtl w:val="0"/>
-        </w:rPr>
-        <w:t xml:space="preserve">Native backends load TripoSG/RMBG from pretrained_weights. Hunyuan and DINO use the shared Hugging Face cache. Painting additionally requires the RealESRGAN checkpoint. See docs/MODEL_WEIGHTS.md for download commands and sizes. Selecting a model does not install it.</w:t>
+        <w:t xml:space="preserve">Use Install workflow models for the selected stage, or choose individual models in the library. Shared checkpoints are reused. ComfyUI runtime installation and verification are separate tracked actions; they never install into the main Python environment.</w:t>
+      </w:r>
+    </w:p>
+    <w:p>
+      <w:pPr>
+        <w:rPr/>
+      </w:pPr>
+      <w:r>
+        <w:rPr>
+          <w:rtl w:val="0"/>
+        </w:rPr>
+        <w:t xml:space="preserve">New weights default to pretrained_weights/managed. Change Storage and credentials for future jobs, or register an existing repository folder after read-only source-hash verification. Existing installations and resumed jobs keep their recorded paths. See docs/MODEL_WEIGHTS.md for details.</w:t>
       </w:r>
     </w:p>
     <w:p>
@@ -2721,7 +2721,7 @@
           <w:vertAlign w:val="baseline"/>
           <w:rtl w:val="0"/>
         </w:rPr>
-        <w:t xml:space="preserve">Missing checkpoint: restore the selected model, then check readiness. CUDA memory failure: review offload and draft settings; do not replace the CUDA stack silently.</w:t>
+        <w:t xml:space="preserve">Missing checkpoint: open Models and install or verify the selected model. Runtime checks can still block downloaded weights. CUDA memory failure: review offload and draft settings; do not replace the CUDA stack silently.</w:t>
       </w:r>
     </w:p>
     <w:p>
@@ -3810,6 +3810,281 @@
           <w:sz w:val="21"/>
         </w:rPr>
         <w:t>Panel crops from the actual app. Scroll inside each panel to reach the remaining controls; full-window images are available in the Markdown operating guide.</w:t>
+      </w:r>
+    </w:p>
+    <w:p>
+      <w:pPr>
+        <w:keepNext/>
+        <w:keepLines/>
+        <w:pageBreakBefore/>
+        <w:spacing w:before="0" w:after="200" w:line="259" w:lineRule="auto"/>
+      </w:pPr>
+      <w:r>
+        <w:rPr>
+          <w:rFonts w:ascii="Helvetica Neue" w:hAnsi="Helvetica Neue"/>
+          <w:b/>
+          <w:color w:val="000000"/>
+          <w:sz w:val="44"/>
+        </w:rPr>
+        <w:t>Models and downloads</w:t>
+      </w:r>
+    </w:p>
+    <w:p>
+      <w:pPr>
+        <w:keepNext w:val="0"/>
+        <w:keepLines/>
+        <w:spacing w:before="0" w:after="140" w:line="259" w:lineRule="auto"/>
+      </w:pPr>
+      <w:r>
+        <w:rPr>
+          <w:rFonts w:ascii="Helvetica Neue" w:hAnsi="Helvetica Neue"/>
+          <w:b w:val="0"/>
+          <w:color w:val="000000"/>
+          <w:sz w:val="22"/>
+        </w:rPr>
+        <w:t>Install and manage AI components inside the same app window. This v1.12.0 screenshot shows the actual production model catalog; no AI weights were installed for the screenshot.</w:t>
+      </w:r>
+    </w:p>
+    <w:p>
+      <w:pPr>
+        <w:keepNext/>
+        <w:keepLines/>
+        <w:spacing w:before="0" w:after="140" w:line="240" w:lineRule="auto"/>
+      </w:pPr>
+      <w:r>
+        <w:rPr>
+          <w:rFonts w:ascii="Helvetica Neue" w:hAnsi="Helvetica Neue"/>
+          <w:b w:val="0"/>
+          <w:color w:val="000000"/>
+          <w:sz w:val="22"/>
+        </w:rPr>
+      </w:r>
+      <w:r>
+        <w:drawing>
+          <wp:inline>
+            <wp:extent cx="5943600" cy="3714750"/>
+            <wp:docPr id="13" name="Picture 13" descr="Actual ModelUnify v1.12.0 Models workspace with model library, prerequisites and installation activity"/>
+            <wp:cNvGraphicFramePr>
+              <a:graphicFrameLocks noChangeAspect="1"/>
+            </wp:cNvGraphicFramePr>
+            <a:graphic>
+              <a:graphicData uri="http://schemas.openxmlformats.org/drawingml/2006/picture">
+                <pic:pic>
+                  <pic:nvPicPr>
+                    <pic:cNvPr id="0" name="models-manager.png"/>
+                    <pic:cNvPicPr/>
+                  </pic:nvPicPr>
+                  <pic:blipFill>
+                    <a:blip r:embed="rId21"/>
+                    <a:stretch>
+                      <a:fillRect/>
+                    </a:stretch>
+                  </pic:blipFill>
+                  <pic:spPr>
+                    <a:xfrm>
+                      <a:off x="0" y="0"/>
+                      <a:ext cx="5943600" cy="3714750"/>
+                    </a:xfrm>
+                    <a:prstGeom prst="rect"/>
+                  </pic:spPr>
+                </pic:pic>
+              </a:graphicData>
+            </a:graphic>
+          </wp:inline>
+        </w:drawing>
+      </w:r>
+    </w:p>
+    <w:p>
+      <w:pPr>
+        <w:keepNext w:val="0"/>
+        <w:keepLines/>
+        <w:spacing w:before="0" w:after="140" w:line="259" w:lineRule="auto"/>
+      </w:pPr>
+      <w:r>
+        <w:rPr>
+          <w:rFonts w:ascii="Helvetica Neue" w:hAnsi="Helvetica Neue"/>
+          <w:b w:val="0"/>
+          <w:color w:val="000000"/>
+          <w:sz w:val="21"/>
+        </w:rPr>
+        <w:t>Library on the left, selected model details in the center and installation activity on the right. Scroll within the panels for storage, existing-folder registration, runtime actions and reviewed cleanup. Back to workbench preserves the existing 3D scene and camera.</w:t>
+      </w:r>
+    </w:p>
+    <w:p>
+      <w:pPr>
+        <w:keepNext w:val="0"/>
+        <w:keepLines/>
+        <w:spacing w:before="0" w:after="140" w:line="259" w:lineRule="auto"/>
+      </w:pPr>
+      <w:r>
+        <w:rPr>
+          <w:rFonts w:ascii="Helvetica Neue" w:hAnsi="Helvetica Neue"/>
+          <w:b w:val="0"/>
+          <w:color w:val="000000"/>
+          <w:sz w:val="21"/>
+        </w:rPr>
+        <w:t>Downloaded files and Ready are separate states. Ready means the recorded files and runtime prerequisites passed their checks; it does not certify model quality or prove that inference was tested.</w:t>
+      </w:r>
+    </w:p>
+    <w:p>
+      <w:pPr>
+        <w:keepNext/>
+        <w:keepLines/>
+        <w:pageBreakBefore/>
+        <w:spacing w:before="0" w:after="200" w:line="259" w:lineRule="auto"/>
+      </w:pPr>
+      <w:r>
+        <w:rPr>
+          <w:rFonts w:ascii="Helvetica Neue" w:hAnsi="Helvetica Neue"/>
+          <w:b/>
+          <w:color w:val="000000"/>
+          <w:sz w:val="44"/>
+        </w:rPr>
+        <w:t>Install verify and recover</w:t>
+      </w:r>
+    </w:p>
+    <w:p>
+      <w:pPr>
+        <w:keepNext w:val="0"/>
+        <w:keepLines/>
+        <w:spacing w:before="0" w:after="120" w:line="259" w:lineRule="auto"/>
+      </w:pPr>
+      <w:r>
+        <w:rPr>
+          <w:rFonts w:ascii="Helvetica Neue" w:hAnsi="Helvetica Neue"/>
+          <w:b w:val="0"/>
+          <w:color w:val="000000"/>
+          <w:sz w:val="21"/>
+        </w:rPr>
+        <w:t>Choose storage. Open Models, then Storage and credentials. Select a dedicated folder with enough free space. Estimates are shown before installation; exact file sizes and an immutable revision resolve when the job starts. The manager checks shared dependencies and installation headroom.</w:t>
+      </w:r>
+    </w:p>
+    <w:p>
+      <w:pPr>
+        <w:keepNext w:val="0"/>
+        <w:keepLines/>
+        <w:spacing w:before="0" w:after="120" w:line="259" w:lineRule="auto"/>
+      </w:pPr>
+      <w:r>
+        <w:rPr>
+          <w:rFonts w:ascii="Helvetica Neue" w:hAnsi="Helvetica Neue"/>
+          <w:b w:val="0"/>
+          <w:color w:val="000000"/>
+          <w:sz w:val="21"/>
+        </w:rPr>
+        <w:t>Install selected models. Use Install workflow models for the selected operation, or select a library row and Install / repair. Pixal single-view automatic FOV needs MoGe; Comfy PBR additionally needs the texture VAE. Existing alpha or a manual mask can avoid an unused background-remover download.</w:t>
+      </w:r>
+    </w:p>
+    <w:p>
+      <w:pPr>
+        <w:keepNext w:val="0"/>
+        <w:keepLines/>
+        <w:spacing w:before="0" w:after="120" w:line="259" w:lineRule="auto"/>
+      </w:pPr>
+      <w:r>
+        <w:rPr>
+          <w:rFonts w:ascii="Helvetica Neue" w:hAnsi="Helvetica Neue"/>
+          <w:b w:val="0"/>
+          <w:color w:val="000000"/>
+          <w:sz w:val="21"/>
+        </w:rPr>
+        <w:t>Follow live activity. Resolving, downloading, verifying and installing are distinct stages. Transfers report real bytes, speed and an estimated remaining time when available. Runtime setup reports logs with indeterminate progress. Returning to the workbench does not stop installation.</w:t>
+      </w:r>
+    </w:p>
+    <w:p>
+      <w:pPr>
+        <w:keepNext w:val="0"/>
+        <w:keepLines/>
+        <w:spacing w:before="0" w:after="120" w:line="259" w:lineRule="auto"/>
+      </w:pPr>
+      <w:r>
+        <w:rPr>
+          <w:rFonts w:ascii="Helvetica Neue" w:hAnsi="Helvetica Neue"/>
+          <w:b w:val="0"/>
+          <w:color w:val="000000"/>
+          <w:sz w:val="21"/>
+        </w:rPr>
+        <w:t>Cancel and resume. Cancel installation waits for a read or safe boundary. Retry / resume reuses retained partial files when the source supports byte ranges. A server restart leaves interrupted jobs waiting for Retry. Resumed jobs retain their pinned revision and original destination.</w:t>
+      </w:r>
+    </w:p>
+    <w:p>
+      <w:pPr>
+        <w:keepNext w:val="0"/>
+        <w:keepLines/>
+        <w:spacing w:before="0" w:after="120" w:line="259" w:lineRule="auto"/>
+      </w:pPr>
+      <w:r>
+        <w:rPr>
+          <w:rFonts w:ascii="Helvetica Neue" w:hAnsi="Helvetica Neue"/>
+          <w:b w:val="0"/>
+          <w:color w:val="000000"/>
+          <w:sz w:val="21"/>
+        </w:rPr>
+        <w:t>Verify runtimes. Use Verify ComfyUI runtime in its isolated environment. Paint additionally needs compatible native extensions; Build paint extensions requires installed MSVC/CUDA tools. Use Verify paint runtime afterward. These checks do not load AI checkpoints or run inference.</w:t>
+      </w:r>
+    </w:p>
+    <w:p>
+      <w:pPr>
+        <w:keepNext w:val="0"/>
+        <w:keepLines/>
+        <w:spacing w:before="0" w:after="120" w:line="259" w:lineRule="auto"/>
+      </w:pPr>
+      <w:r>
+        <w:rPr>
+          <w:rFonts w:ascii="Helvetica Neue" w:hAnsi="Helvetica Neue"/>
+          <w:b w:val="0"/>
+          <w:color w:val="000000"/>
+          <w:sz w:val="21"/>
+        </w:rPr>
+        <w:t>Repair and remove. Verify files hashes the recorded installation. Install / repair restores missing or corrupt files; Update model explicitly resolves its upstream recipe. Preview owned-file removal and confirm its exact list. Active components and shared dependencies are protected. External registered files remain read-only.</w:t>
+      </w:r>
+    </w:p>
+    <w:p>
+      <w:pPr>
+        <w:keepNext w:val="0"/>
+        <w:keepLines/>
+        <w:spacing w:before="0" w:after="120" w:line="259" w:lineRule="auto"/>
+      </w:pPr>
+      <w:r>
+        <w:rPr>
+          <w:rFonts w:ascii="Helvetica Neue" w:hAnsi="Helvetica Neue"/>
+          <w:b w:val="0"/>
+          <w:color w:val="000000"/>
+          <w:sz w:val="21"/>
+        </w:rPr>
+        <w:t>Recover space safely. Discard retained download files separately previews partial and completed-but-unpublished files. Published models and unrelated files stay intact. Removed download bytes must be fetched again if that job is retried.</w:t>
+      </w:r>
+    </w:p>
+    <w:p>
+      <w:pPr>
+        <w:keepNext w:val="0"/>
+        <w:keepLines/>
+        <w:spacing w:before="0" w:after="120" w:line="259" w:lineRule="auto"/>
+      </w:pPr>
+      <w:r>
+        <w:rPr>
+          <w:rFonts w:ascii="Helvetica Neue" w:hAnsi="Helvetica Neue"/>
+          <w:b w:val="0"/>
+          <w:color w:val="000000"/>
+          <w:sz w:val="21"/>
+        </w:rPr>
+        <w:t>Keep credentials private. A Hugging Face token can be entered for the server session if the source requires it. It stays in memory and is not stored in configuration, jobs or logs. Follow the linked model terms and access requirements.</w:t>
+      </w:r>
+    </w:p>
+    <w:p>
+      <w:pPr>
+        <w:keepNext w:val="0"/>
+        <w:keepLines/>
+        <w:spacing w:before="0" w:after="100" w:line="259" w:lineRule="auto"/>
+      </w:pPr>
+      <w:r>
+        <w:rPr>
+          <w:rFonts w:ascii="Helvetica Neue" w:hAnsi="Helvetica Neue"/>
+          <w:b w:val="0"/>
+          <w:color w:val="000000"/>
+          <w:sz w:val="21"/>
+        </w:rPr>
+        <w:t>Release tracking. CHANGELOG.md records each version and its main changes. Source exports include a commit manifest, per-file hashes and an archive checksum. They exclude Python runtimes and AI weights; follow INSTALLATION.md after extraction.</w:t>
       </w:r>
     </w:p>
     <w:sectPr>

</xml_diff>